<commit_message>
docs: ajout des procedures detaillees de revocation mobile et serveur (DATS, Audit Mobile, Audit API)
</commit_message>
<xml_diff>
--- a/docx/01_DATS.docx
+++ b/docx/01_DATS.docx
@@ -85,7 +85,7 @@
       </w:r>
     </w:p>
     <w:bookmarkEnd w:id="9"/>
-    <w:bookmarkStart w:id="15" w:name="présentation-de-la-solution"/>
+    <w:bookmarkStart w:id="17" w:name="présentation-de-la-solution"/>
     <w:p>
       <w:pPr>
         <w:pStyle w:val="Heading2"/>
@@ -327,31 +327,17 @@
         <w:t xml:space="preserve"> </w:t>
       </w:r>
       <w:r>
-        <w:t xml:space="preserve">- le contrôle d’accès aux flux de données de santé (liaison stricte Device UUID / Organisation).</w:t>
-      </w:r>
-    </w:p>
-    <w:p>
-      <w:pPr>
-        <w:pStyle w:val="BodyText"/>
-      </w:pPr>
-      <w:r>
-        <w:t xml:space="preserve">La révocation d’un terminal entraîne l’invalidation immédiate de son</w:t>
-      </w:r>
-      <w:r>
-        <w:t xml:space="preserve"> </w:t>
-      </w:r>
-      <w:r>
-        <w:t xml:space="preserve">jeton d’accès.</w:t>
+        <w:t xml:space="preserve">- le contrôle d’accès aux flux de données de santé (liaison matérielle stricte Device UUID / Organisation).</w:t>
       </w:r>
     </w:p>
     <w:bookmarkEnd w:id="10"/>
-    <w:bookmarkStart w:id="11" w:name="byod-et-mobilité-sécurisée"/>
+    <w:bookmarkStart w:id="12" w:name="X7ad2acdcfe79b528030858ba730215385622b63"/>
     <w:p>
       <w:pPr>
         <w:pStyle w:val="Heading3"/>
       </w:pPr>
       <w:r>
-        <w:t xml:space="preserve">1.2 BYOD et Mobilité Sécurisée</w:t>
+        <w:t xml:space="preserve">1.2 Cycle de vie et Procédure de Révocation des Terminaux</w:t>
       </w:r>
     </w:p>
     <w:p>
@@ -359,210 +345,259 @@
         <w:pStyle w:val="FirstParagraph"/>
       </w:pPr>
       <w:r>
-        <w:t xml:space="preserve">L’application MacroscopiX a été conçue pour un accès BYOD (Bring Your</w:t>
-      </w:r>
-      <w:r>
-        <w:t xml:space="preserve"> </w:t>
-      </w:r>
-      <w:r>
-        <w:t xml:space="preserve">Own Device) lorsque cela est compatible avec la politique du Système</w:t>
-      </w:r>
-      <w:r>
-        <w:t xml:space="preserve"> </w:t>
-      </w:r>
-      <w:r>
-        <w:t xml:space="preserve">d’Information de l’établissement via 4G/5G ou réseau Wi-Fi dédié. Les conditions sont les</w:t>
-      </w:r>
-      <w:r>
-        <w:t xml:space="preserve"> </w:t>
-      </w:r>
-      <w:r>
-        <w:t xml:space="preserve">suivantes :</w:t>
-      </w:r>
-    </w:p>
-    <w:p>
-      <w:pPr>
+        <w:t xml:space="preserve">La maîtrise de la flotte mobile et du parc BYOD impose des mécanismes de révocation instantanés et déterministes. MacroscopiX prend en compte tous les scénarios de rupture d’habilitation :</w:t>
+      </w:r>
+    </w:p>
+    <w:bookmarkStart w:id="11" w:name="Xa8f8969dd575c10375e435e48cc403329a3fc30"/>
+    <w:p>
+      <w:pPr>
+        <w:pStyle w:val="Heading4"/>
+      </w:pPr>
+      <w:r>
+        <w:t xml:space="preserve">Scénarios de Révocation et Réponses du Système</w:t>
+      </w:r>
+    </w:p>
+    <w:p>
+      <w:pPr>
+        <w:pStyle w:val="Compact"/>
         <w:numPr>
           <w:ilvl w:val="0"/>
           <w:numId w:val="1003"/>
         </w:numPr>
       </w:pPr>
       <w:r>
-        <w:t xml:space="preserve">Le terminal doit être préalablement enrôlé et validé par un référent</w:t>
-      </w:r>
-      <w:r>
-        <w:t xml:space="preserve"> </w:t>
-      </w:r>
-      <w:r>
-        <w:t xml:space="preserve">désigné de l’établissement.</w:t>
-      </w:r>
-    </w:p>
-    <w:p>
-      <w:pPr>
+        <w:rPr>
+          <w:b/>
+          <w:bCs/>
+        </w:rPr>
+        <w:t xml:space="preserve">Perte, Vol ou Compromission du Terminal :</w:t>
+      </w:r>
+    </w:p>
+    <w:p>
+      <w:pPr>
+        <w:pStyle w:val="Compact"/>
+        <w:numPr>
+          <w:ilvl w:val="1"/>
+          <w:numId w:val="1004"/>
+        </w:numPr>
+      </w:pPr>
+      <w:r>
+        <w:rPr>
+          <w:b/>
+          <w:bCs/>
+        </w:rPr>
+        <w:t xml:space="preserve">Action Référent / Administrateur :</w:t>
+      </w:r>
+      <w:r>
+        <w:t xml:space="preserve"> </w:t>
+      </w:r>
+      <w:r>
+        <w:t xml:space="preserve">Depuis la console d’administration (</w:t>
+      </w:r>
+      <w:r>
+        <w:rPr>
+          <w:rStyle w:val="VerbatimChar"/>
+        </w:rPr>
+        <w:t xml:space="preserve">admin.macroscopix.fr</w:t>
+      </w:r>
+      <w:r>
+        <w:t xml:space="preserve">) ou via l’API sécurisée (</w:t>
+      </w:r>
+      <w:r>
+        <w:rPr>
+          <w:rStyle w:val="VerbatimChar"/>
+        </w:rPr>
+        <w:t xml:space="preserve">DELETE /terminals/{uuid}</w:t>
+      </w:r>
+      <w:r>
+        <w:t xml:space="preserve">), l’administrateur technique révoque le terminal en un clic.</w:t>
+      </w:r>
+    </w:p>
+    <w:p>
+      <w:pPr>
+        <w:pStyle w:val="Compact"/>
+        <w:numPr>
+          <w:ilvl w:val="1"/>
+          <w:numId w:val="1004"/>
+        </w:numPr>
+      </w:pPr>
+      <w:r>
+        <w:rPr>
+          <w:b/>
+          <w:bCs/>
+        </w:rPr>
+        <w:t xml:space="preserve">Effet Serveur Immédiat :</w:t>
+      </w:r>
+      <w:r>
+        <w:t xml:space="preserve"> </w:t>
+      </w:r>
+      <w:r>
+        <w:t xml:space="preserve">Le</w:t>
+      </w:r>
+      <w:r>
+        <w:t xml:space="preserve"> </w:t>
+      </w:r>
+      <w:r>
+        <w:rPr>
+          <w:rStyle w:val="VerbatimChar"/>
+        </w:rPr>
+        <w:t xml:space="preserve">terminal_secret</w:t>
+      </w:r>
+      <w:r>
+        <w:t xml:space="preserve"> </w:t>
+      </w:r>
+      <w:r>
+        <w:t xml:space="preserve">(Bearer Token) est purgé de la table des terminaux autorisés et son statut bascule à inactif.</w:t>
+      </w:r>
+    </w:p>
+    <w:p>
+      <w:pPr>
+        <w:pStyle w:val="Compact"/>
+        <w:numPr>
+          <w:ilvl w:val="1"/>
+          <w:numId w:val="1004"/>
+        </w:numPr>
+      </w:pPr>
+      <w:r>
+        <w:rPr>
+          <w:b/>
+          <w:bCs/>
+        </w:rPr>
+        <w:t xml:space="preserve">Blocage des Flux :</w:t>
+      </w:r>
+      <w:r>
+        <w:t xml:space="preserve"> </w:t>
+      </w:r>
+      <w:r>
+        <w:t xml:space="preserve">Toute tentative d’authentification (</w:t>
+      </w:r>
+      <w:r>
+        <w:rPr>
+          <w:rStyle w:val="VerbatimChar"/>
+        </w:rPr>
+        <w:t xml:space="preserve">/check-auth</w:t>
+      </w:r>
+      <w:r>
+        <w:t xml:space="preserve">) ou de journalisation (</w:t>
+      </w:r>
+      <w:r>
+        <w:rPr>
+          <w:rStyle w:val="VerbatimChar"/>
+        </w:rPr>
+        <w:t xml:space="preserve">/log-transfer</w:t>
+      </w:r>
+      <w:r>
+        <w:t xml:space="preserve">) est immédiatement rejetée avec une erreur</w:t>
+      </w:r>
+      <w:r>
+        <w:t xml:space="preserve"> </w:t>
+      </w:r>
+      <w:r>
+        <w:rPr>
+          <w:b/>
+          <w:bCs/>
+        </w:rPr>
+        <w:t xml:space="preserve">HTTP 401 Unauthorized</w:t>
+      </w:r>
+      <w:r>
+        <w:t xml:space="preserve">.</w:t>
+      </w:r>
+    </w:p>
+    <w:p>
+      <w:pPr>
+        <w:pStyle w:val="Compact"/>
+        <w:numPr>
+          <w:ilvl w:val="1"/>
+          <w:numId w:val="1004"/>
+        </w:numPr>
+      </w:pPr>
+      <w:r>
+        <w:rPr>
+          <w:b/>
+          <w:bCs/>
+        </w:rPr>
+        <w:t xml:space="preserve">Dissociation Matérielle :</w:t>
+      </w:r>
+      <w:r>
+        <w:t xml:space="preserve"> </w:t>
+      </w:r>
+      <w:r>
+        <w:t xml:space="preserve">L’association entre le</w:t>
+      </w:r>
+      <w:r>
+        <w:t xml:space="preserve"> </w:t>
+      </w:r>
+      <w:r>
+        <w:rPr>
+          <w:rStyle w:val="VerbatimChar"/>
+        </w:rPr>
+        <w:t xml:space="preserve">device_uuid</w:t>
+      </w:r>
+      <w:r>
+        <w:t xml:space="preserve"> </w:t>
+      </w:r>
+      <w:r>
+        <w:t xml:space="preserve">matériel et l’établissement est rompue, libérant instantanément le slot de licence de l’organisation (</w:t>
+      </w:r>
+      <w:r>
+        <w:rPr>
+          <w:rStyle w:val="VerbatimChar"/>
+        </w:rPr>
+        <w:t xml:space="preserve">max_slots</w:t>
+      </w:r>
+      <w:r>
+        <w:t xml:space="preserve">).</w:t>
+      </w:r>
+    </w:p>
+    <w:p>
+      <w:pPr>
+        <w:pStyle w:val="Compact"/>
+        <w:numPr>
+          <w:ilvl w:val="1"/>
+          <w:numId w:val="1004"/>
+        </w:numPr>
+      </w:pPr>
+      <w:r>
+        <w:rPr>
+          <w:b/>
+          <w:bCs/>
+        </w:rPr>
+        <w:t xml:space="preserve">Protection des Données :</w:t>
+      </w:r>
+      <w:r>
+        <w:t xml:space="preserve"> </w:t>
+      </w:r>
+      <w:r>
+        <w:t xml:space="preserve">En vertu du principe de</w:t>
+      </w:r>
+      <w:r>
+        <w:t xml:space="preserve"> </w:t>
+      </w:r>
+      <w:r>
+        <w:rPr>
+          <w:b/>
+          <w:bCs/>
+        </w:rPr>
+        <w:t xml:space="preserve">Zéro Persistance</w:t>
+      </w:r>
+      <w:r>
+        <w:t xml:space="preserve">, aucun cliché, dictée ou document médical ne réside sur le stockage interne ou dans la galerie du téléphone égaré.</w:t>
+      </w:r>
+    </w:p>
+    <w:p>
+      <w:pPr>
+        <w:pStyle w:val="Compact"/>
         <w:numPr>
           <w:ilvl w:val="0"/>
           <w:numId w:val="1003"/>
         </w:numPr>
       </w:pPr>
       <w:r>
-        <w:t xml:space="preserve">Les données de santé transitent exclusivement via l’infrastructure HDS</w:t>
-      </w:r>
-      <w:r>
-        <w:t xml:space="preserve"> </w:t>
-      </w:r>
-      <w:r>
-        <w:t xml:space="preserve">MacroscopiX (05_Audit_Webdav_HDS.md) et utilisent le service</w:t>
-      </w:r>
-      <w:r>
-        <w:t xml:space="preserve"> </w:t>
-      </w:r>
-      <w:r>
-        <w:t xml:space="preserve">MacroscopixSync (06_Audit_Sync_Service.md).</w:t>
-      </w:r>
-    </w:p>
-    <w:p>
-      <w:pPr>
-        <w:pStyle w:val="FirstParagraph"/>
-      </w:pPr>
-      <w:r>
-        <w:t xml:space="preserve">Cette approche permet aux praticiens d’utiliser leurs smartphones</w:t>
-      </w:r>
-      <w:r>
-        <w:t xml:space="preserve"> </w:t>
-      </w:r>
-      <w:r>
-        <w:t xml:space="preserve">tout en assurant la sécurité, la traçabilité et la</w:t>
-      </w:r>
-      <w:r>
-        <w:t xml:space="preserve"> </w:t>
-      </w:r>
-      <w:r>
-        <w:t xml:space="preserve">conformité HDS des données de santé.</w:t>
-      </w:r>
-    </w:p>
-    <w:bookmarkEnd w:id="11"/>
-    <w:bookmarkStart w:id="13" w:name="X3089b4bd61df99141e5cfd59ef2f545dd9ad2b0"/>
-    <w:p>
-      <w:pPr>
-        <w:pStyle w:val="Heading3"/>
-      </w:pPr>
-      <w:r>
-        <w:t xml:space="preserve">1.3 Contexte clinique et flux de travail multi-modal</w:t>
-      </w:r>
-    </w:p>
-    <w:p>
-      <w:pPr>
-        <w:pStyle w:val="FirstParagraph"/>
-      </w:pPr>
-      <w:r>
-        <w:t xml:space="preserve">L’application est destinée à être utilisée en</w:t>
-      </w:r>
-      <w:r>
-        <w:t xml:space="preserve"> </w:t>
-      </w:r>
-      <w:r>
-        <w:rPr>
-          <w:b/>
-          <w:bCs/>
-        </w:rPr>
-        <w:t xml:space="preserve">laboratoire d’Anatomie</w:t>
-      </w:r>
-      <w:r>
-        <w:rPr>
-          <w:b/>
-          <w:bCs/>
-        </w:rPr>
-        <w:t xml:space="preserve"> </w:t>
-      </w:r>
-      <w:r>
-        <w:rPr>
-          <w:b/>
-          <w:bCs/>
-        </w:rPr>
-        <w:t xml:space="preserve">et Cytologie Pathologiques (ACP)</w:t>
-      </w:r>
-      <w:r>
-        <w:t xml:space="preserve">, environnement technique contraint</w:t>
-      </w:r>
-      <w:r>
-        <w:t xml:space="preserve"> </w:t>
-      </w:r>
-      <w:r>
-        <w:t xml:space="preserve">(manipulation de formol, port de gants, risques chimiques) nécessitant</w:t>
-      </w:r>
-      <w:r>
-        <w:t xml:space="preserve"> </w:t>
-      </w:r>
-      <w:r>
-        <w:t xml:space="preserve">des outils rapides, robustes et ergonomiques, compatibles avec un usage</w:t>
-      </w:r>
-      <w:r>
-        <w:t xml:space="preserve"> </w:t>
-      </w:r>
-      <w:r>
-        <w:t xml:space="preserve">« sans contact ».</w:t>
-      </w:r>
-    </w:p>
-    <w:p>
-      <w:pPr>
-        <w:pStyle w:val="BodyText"/>
-      </w:pPr>
-      <w:r>
-        <w:t xml:space="preserve">Workflow sécurisé type :</w:t>
-      </w:r>
-    </w:p>
-    <w:p>
-      <w:pPr>
-        <w:numPr>
-          <w:ilvl w:val="0"/>
-          <w:numId w:val="1004"/>
-        </w:numPr>
-      </w:pPr>
-      <w:r>
-        <w:rPr>
-          <w:b/>
-          <w:bCs/>
-        </w:rPr>
-        <w:t xml:space="preserve">Identification (entrée)</w:t>
-      </w:r>
-      <w:r>
-        <w:br/>
-      </w:r>
-      <w:r>
-        <w:t xml:space="preserve">Le praticien scanne le code-barres ou le DataMatrix du dossier</w:t>
-      </w:r>
-      <w:r>
-        <w:t xml:space="preserve"> </w:t>
-      </w:r>
-      <w:r>
-        <w:t xml:space="preserve">(numéro d’examen) directement sur la demande d’examen. L’absence de</w:t>
-      </w:r>
-      <w:r>
-        <w:t xml:space="preserve"> </w:t>
-      </w:r>
-      <w:r>
-        <w:t xml:space="preserve">saisie manuelle élimine les risques d’erreurs d’identitovigilance.</w:t>
-      </w:r>
-    </w:p>
-    <w:p>
-      <w:pPr>
-        <w:numPr>
-          <w:ilvl w:val="0"/>
-          <w:numId w:val="1004"/>
-        </w:numPr>
-      </w:pPr>
-      <w:r>
-        <w:rPr>
-          <w:b/>
-          <w:bCs/>
-        </w:rPr>
-        <w:t xml:space="preserve">Acquisition multi-modale</w:t>
-      </w:r>
-      <w:r>
-        <w:t xml:space="preserve"> </w:t>
-      </w:r>
-      <w:r>
-        <w:t xml:space="preserve">:</w:t>
+        <w:rPr>
+          <w:b/>
+          <w:bCs/>
+        </w:rPr>
+        <w:t xml:space="preserve">Désinstallation ou Réinitialisation par l’Utilisateur :</w:t>
       </w:r>
     </w:p>
     <w:p>
@@ -578,19 +613,29 @@
           <w:b/>
           <w:bCs/>
         </w:rPr>
-        <w:t xml:space="preserve">Photographies macroscopiques</w:t>
-      </w:r>
-      <w:r>
-        <w:t xml:space="preserve"> </w:t>
-      </w:r>
-      <w:r>
-        <w:t xml:space="preserve">: Clichés haute résolution des pièces opératoires</w:t>
-      </w:r>
-      <w:r>
-        <w:t xml:space="preserve"> </w:t>
-      </w:r>
-      <w:r>
-        <w:t xml:space="preserve">et prélèvements avec recadrage et balance des blancs optimisée.</w:t>
+        <w:t xml:space="preserve">Côté Terminal Mobile :</w:t>
+      </w:r>
+      <w:r>
+        <w:t xml:space="preserve"> </w:t>
+      </w:r>
+      <w:r>
+        <w:t xml:space="preserve">La désinstallation de l’application détruit définitivement les clés privées et secrets d’accès logés dans le</w:t>
+      </w:r>
+      <w:r>
+        <w:t xml:space="preserve"> </w:t>
+      </w:r>
+      <w:r>
+        <w:rPr>
+          <w:b/>
+          <w:bCs/>
+        </w:rPr>
+        <w:t xml:space="preserve">Keystore Android</w:t>
+      </w:r>
+      <w:r>
+        <w:t xml:space="preserve"> </w:t>
+      </w:r>
+      <w:r>
+        <w:t xml:space="preserve">sécurisé.</w:t>
       </w:r>
     </w:p>
     <w:p>
@@ -606,128 +651,56 @@
           <w:b/>
           <w:bCs/>
         </w:rPr>
-        <w:t xml:space="preserve">Dictaphone intégré</w:t>
-      </w:r>
-      <w:r>
-        <w:t xml:space="preserve"> </w:t>
-      </w:r>
-      <w:r>
-        <w:t xml:space="preserve">: Enregistrement vocal des descriptions macroscopiques</w:t>
-      </w:r>
-      <w:r>
-        <w:t xml:space="preserve"> </w:t>
-      </w:r>
-      <w:r>
-        <w:t xml:space="preserve">(format WAV audio haute fidélité) rattaché au numéro de prélèvement.</w:t>
-      </w:r>
-    </w:p>
-    <w:p>
-      <w:pPr>
-        <w:pStyle w:val="Compact"/>
-        <w:numPr>
-          <w:ilvl w:val="1"/>
-          <w:numId w:val="1005"/>
-        </w:numPr>
-      </w:pPr>
-      <w:r>
-        <w:rPr>
-          <w:b/>
-          <w:bCs/>
-        </w:rPr>
-        <w:t xml:space="preserve">Scanner documentaire</w:t>
-      </w:r>
-      <w:r>
-        <w:t xml:space="preserve"> </w:t>
-      </w:r>
-      <w:r>
-        <w:t xml:space="preserve">: Numérisation des ordonnances, comptes-rendus extérieurs</w:t>
-      </w:r>
-      <w:r>
-        <w:t xml:space="preserve"> </w:t>
-      </w:r>
-      <w:r>
-        <w:t xml:space="preserve">ou feuilles de transmission au format PDF multi-pages.</w:t>
-      </w:r>
-    </w:p>
-    <w:p>
-      <w:pPr>
+        <w:t xml:space="preserve">Révocation Volontaire (Déconnexion de l’App) :</w:t>
+      </w:r>
+      <w:r>
+        <w:t xml:space="preserve"> </w:t>
+      </w:r>
+      <w:r>
+        <w:t xml:space="preserve">L’application dispose d’un bouton de déconnexion / désenrôlement explicite appelant la route</w:t>
+      </w:r>
+      <w:r>
+        <w:t xml:space="preserve"> </w:t>
+      </w:r>
+      <w:r>
+        <w:rPr>
+          <w:rStyle w:val="VerbatimChar"/>
+        </w:rPr>
+        <w:t xml:space="preserve">/revoke-terminal</w:t>
+      </w:r>
+      <w:r>
+        <w:t xml:space="preserve"> </w:t>
+      </w:r>
+      <w:r>
+        <w:t xml:space="preserve">(avec en-tête</w:t>
+      </w:r>
+      <w:r>
+        <w:t xml:space="preserve"> </w:t>
+      </w:r>
+      <w:r>
+        <w:rPr>
+          <w:rStyle w:val="VerbatimChar"/>
+        </w:rPr>
+        <w:t xml:space="preserve">Authorization: Bearer &lt;secret&gt;</w:t>
+      </w:r>
+      <w:r>
+        <w:t xml:space="preserve">). Le secret de session est instantanément invalidé en base centrale et le cache sandbox local est intégralement purgé.</w:t>
+      </w:r>
+    </w:p>
+    <w:p>
+      <w:pPr>
+        <w:pStyle w:val="Compact"/>
         <w:numPr>
           <w:ilvl w:val="0"/>
-          <w:numId w:val="1004"/>
-        </w:numPr>
-      </w:pPr>
-      <w:r>
-        <w:rPr>
-          <w:b/>
-          <w:bCs/>
-        </w:rPr>
-        <w:t xml:space="preserve">Transfert (sortie)</w:t>
-      </w:r>
-      <w:r>
-        <w:br/>
-      </w:r>
-      <w:r>
-        <w:t xml:space="preserve">Envoi immédiat et automatique des fichiers vers le serveur sécurisé WebDAV HDS</w:t>
-      </w:r>
-      <w:r>
-        <w:t xml:space="preserve"> </w:t>
-      </w:r>
-      <w:r>
-        <w:t xml:space="preserve">(timeouts réseau configurés à 120s pour résister aux liaisons hospitalières instables).</w:t>
-      </w:r>
-    </w:p>
-    <w:p>
-      <w:pPr>
-        <w:numPr>
-          <w:ilvl w:val="0"/>
-          <w:numId w:val="1004"/>
-        </w:numPr>
-      </w:pPr>
-      <w:r>
-        <w:rPr>
-          <w:b/>
-          <w:bCs/>
-        </w:rPr>
-        <w:t xml:space="preserve">Purge immédiate</w:t>
-      </w:r>
-      <w:r>
-        <w:br/>
-      </w:r>
-      <w:r>
-        <w:t xml:space="preserve">Suppression automatique et irréversible des fichiers de la mémoire vive et du cache</w:t>
-      </w:r>
-      <w:r>
-        <w:t xml:space="preserve"> </w:t>
-      </w:r>
-      <w:r>
-        <w:t xml:space="preserve">chiffré du terminal dès réception de l’acquittement HTTP 201/204 du serveur.</w:t>
-      </w:r>
-    </w:p>
-    <w:p>
-      <w:pPr>
-        <w:numPr>
-          <w:ilvl w:val="0"/>
-          <w:numId w:val="1004"/>
-        </w:numPr>
-      </w:pPr>
-      <w:r>
-        <w:rPr>
-          <w:b/>
-          <w:bCs/>
-        </w:rPr>
-        <w:t xml:space="preserve">Aiguillage et intégration au SI hospitalier</w:t>
-      </w:r>
-      <w:r>
-        <w:br/>
-      </w:r>
-      <w:r>
-        <w:t xml:space="preserve">L’agent local MacroscopixSync rapatrie les fichiers et les achemine vers les répertoires</w:t>
-      </w:r>
-      <w:r>
-        <w:t xml:space="preserve"> </w:t>
-      </w:r>
-      <w:r>
-        <w:t xml:space="preserve">cibles appropriés du Système de Gestion de Laboratoire (SGL) / NAS :</w:t>
+          <w:numId w:val="1003"/>
+        </w:numPr>
+      </w:pPr>
+      <w:r>
+        <w:rPr>
+          <w:b/>
+          <w:bCs/>
+        </w:rPr>
+        <w:t xml:space="preserve">Renouvellement d’Appareil / Ré-enrôlement :</w:t>
       </w:r>
     </w:p>
     <w:p>
@@ -739,16 +712,7 @@
         </w:numPr>
       </w:pPr>
       <w:r>
-        <w:t xml:space="preserve">Dossier Images : Répertoire racine configuré (</w:t>
-      </w:r>
-      <w:r>
-        <w:rPr>
-          <w:rStyle w:val="VerbatimChar"/>
-        </w:rPr>
-        <w:t xml:space="preserve">LocalPath</w:t>
-      </w:r>
-      <w:r>
-        <w:t xml:space="preserve">).</w:t>
+        <w:t xml:space="preserve">Si un utilisateur change de smartphone ou le réinitialise (générant un nouvel UUID), un nouvel OTP envoyé à l’adresse institutionnelle nominative du référent est requis pour valider le nouveau couple matériel.</w:t>
       </w:r>
     </w:p>
     <w:p>
@@ -760,248 +724,123 @@
         </w:numPr>
       </w:pPr>
       <w:r>
-        <w:t xml:space="preserve">Dossier Documents PDF : Répertoire dédié (</w:t>
+        <w:t xml:space="preserve">L’ancien terminal peut être soit écrasé proprement via le même nom d’équipement (</w:t>
       </w:r>
       <w:r>
         <w:rPr>
           <w:rStyle w:val="VerbatimChar"/>
         </w:rPr>
-        <w:t xml:space="preserve">PdfLocalPath</w:t>
-      </w:r>
-      <w:r>
-        <w:t xml:space="preserve">).</w:t>
-      </w:r>
-    </w:p>
-    <w:p>
-      <w:pPr>
-        <w:pStyle w:val="Compact"/>
-        <w:numPr>
-          <w:ilvl w:val="1"/>
-          <w:numId w:val="1006"/>
-        </w:numPr>
-      </w:pPr>
-      <w:r>
-        <w:t xml:space="preserve">Dossier Audio : Répertoire de dictée (</w:t>
-      </w:r>
-      <w:r>
-        <w:rPr>
-          <w:rStyle w:val="VerbatimChar"/>
-        </w:rPr>
-        <w:t xml:space="preserve">AudioLocalPath</w:t>
-      </w:r>
-      <w:r>
-        <w:t xml:space="preserve">), avec normalisation automatique</w:t>
-      </w:r>
-      <w:r>
-        <w:t xml:space="preserve"> </w:t>
-      </w:r>
-      <w:r>
-        <w:t xml:space="preserve">des sous-dossiers (suppression des underscores type</w:t>
-      </w:r>
-      <w:r>
-        <w:t xml:space="preserve"> </w:t>
-      </w:r>
-      <w:r>
-        <w:rPr>
-          <w:rStyle w:val="VerbatimChar"/>
-        </w:rPr>
-        <w:t xml:space="preserve">DossierPrelevement</w:t>
-      </w:r>
-      <w:r>
-        <w:t xml:space="preserve"> </w:t>
-      </w:r>
-      <w:r>
-        <w:t xml:space="preserve">pour compatibilité</w:t>
-      </w:r>
-      <w:r>
-        <w:t xml:space="preserve"> </w:t>
-      </w:r>
-      <w:r>
-        <w:t xml:space="preserve">avec les logiciels de transcription médicale).</w:t>
-      </w:r>
-    </w:p>
-    <w:bookmarkStart w:id="12" w:name="objectifs-de-sécurité-majeurs"/>
-    <w:p>
-      <w:pPr>
-        <w:pStyle w:val="Heading4"/>
-      </w:pPr>
-      <w:r>
-        <w:t xml:space="preserve">Objectifs de sécurité majeurs</w:t>
-      </w:r>
-    </w:p>
-    <w:p>
-      <w:pPr>
-        <w:pStyle w:val="Compact"/>
+        <w:t xml:space="preserve">friendly_name</w:t>
+      </w:r>
+      <w:r>
+        <w:t xml:space="preserve">), soit révoqué préalablement pour libérer le quota de licences.</w:t>
+      </w:r>
+    </w:p>
+    <w:bookmarkEnd w:id="11"/>
+    <w:bookmarkEnd w:id="12"/>
+    <w:bookmarkStart w:id="13" w:name="byod-et-mobilité-sécurisée"/>
+    <w:p>
+      <w:pPr>
+        <w:pStyle w:val="Heading3"/>
+      </w:pPr>
+      <w:r>
+        <w:t xml:space="preserve">1.3 BYOD et Mobilité Sécurisée</w:t>
+      </w:r>
+    </w:p>
+    <w:p>
+      <w:pPr>
+        <w:pStyle w:val="FirstParagraph"/>
+      </w:pPr>
+      <w:r>
+        <w:t xml:space="preserve">L’application MacroscopiX a été conçue pour un accès BYOD (Bring Your</w:t>
+      </w:r>
+      <w:r>
+        <w:t xml:space="preserve"> </w:t>
+      </w:r>
+      <w:r>
+        <w:t xml:space="preserve">Own Device) lorsque cela est compatible avec la politique du Système</w:t>
+      </w:r>
+      <w:r>
+        <w:t xml:space="preserve"> </w:t>
+      </w:r>
+      <w:r>
+        <w:t xml:space="preserve">d’Information de l’établissement via 4G/5G ou réseau Wi-Fi dédié. Les conditions sont les</w:t>
+      </w:r>
+      <w:r>
+        <w:t xml:space="preserve"> </w:t>
+      </w:r>
+      <w:r>
+        <w:t xml:space="preserve">suivantes :</w:t>
+      </w:r>
+    </w:p>
+    <w:p>
+      <w:pPr>
         <w:numPr>
           <w:ilvl w:val="0"/>
           <w:numId w:val="1007"/>
         </w:numPr>
       </w:pPr>
       <w:r>
-        <w:rPr>
-          <w:b/>
-          <w:bCs/>
-        </w:rPr>
-        <w:t xml:space="preserve">Zéro persistance :</w:t>
-      </w:r>
-      <w:r>
-        <w:t xml:space="preserve"> </w:t>
-      </w:r>
-      <w:r>
-        <w:t xml:space="preserve">aucune donnée de santé n’est conservée sur le</w:t>
-      </w:r>
-      <w:r>
-        <w:t xml:space="preserve"> </w:t>
-      </w:r>
-      <w:r>
-        <w:t xml:space="preserve">terminal mobile après le transfert.</w:t>
-      </w:r>
-    </w:p>
-    <w:p>
-      <w:pPr>
-        <w:pStyle w:val="Compact"/>
+        <w:t xml:space="preserve">Le terminal doit être préalablement enrôlé et validé par un référent</w:t>
+      </w:r>
+      <w:r>
+        <w:t xml:space="preserve"> </w:t>
+      </w:r>
+      <w:r>
+        <w:t xml:space="preserve">désigné de l’établissement.</w:t>
+      </w:r>
+    </w:p>
+    <w:p>
+      <w:pPr>
         <w:numPr>
           <w:ilvl w:val="0"/>
           <w:numId w:val="1007"/>
         </w:numPr>
       </w:pPr>
       <w:r>
-        <w:rPr>
-          <w:b/>
-          <w:bCs/>
-        </w:rPr>
-        <w:t xml:space="preserve">Cloisonnement strict :</w:t>
-      </w:r>
-      <w:r>
-        <w:t xml:space="preserve"> </w:t>
-      </w:r>
-      <w:r>
-        <w:t xml:space="preserve">séparation physique et logique entre les</w:t>
-      </w:r>
-      <w:r>
-        <w:t xml:space="preserve"> </w:t>
-      </w:r>
-      <w:r>
-        <w:t xml:space="preserve">flux d’administration (FastAPI / PHP) et les flux de données de santé (WebDAV HDS / S3).</w:t>
-      </w:r>
-    </w:p>
-    <w:p>
-      <w:pPr>
-        <w:pStyle w:val="Compact"/>
-        <w:numPr>
-          <w:ilvl w:val="0"/>
-          <w:numId w:val="1007"/>
-        </w:numPr>
-      </w:pPr>
-      <w:r>
-        <w:rPr>
-          <w:b/>
-          <w:bCs/>
-        </w:rPr>
-        <w:t xml:space="preserve">Intégrité et confidentialité :</w:t>
-      </w:r>
-      <w:r>
-        <w:t xml:space="preserve"> </w:t>
-      </w:r>
-      <w:r>
-        <w:t xml:space="preserve">chiffrement des flux réseau de bout</w:t>
-      </w:r>
-      <w:r>
-        <w:t xml:space="preserve"> </w:t>
-      </w:r>
-      <w:r>
-        <w:t xml:space="preserve">en bout (TLS ≥ 1.2, TLS 1.3 privilégié).</w:t>
-      </w:r>
-    </w:p>
-    <w:p>
-      <w:pPr>
-        <w:pStyle w:val="Compact"/>
-        <w:numPr>
-          <w:ilvl w:val="0"/>
-          <w:numId w:val="1007"/>
-        </w:numPr>
-      </w:pPr>
-      <w:r>
-        <w:rPr>
-          <w:b/>
-          <w:bCs/>
-        </w:rPr>
-        <w:t xml:space="preserve">Contrôle d’intégrité strict avant purge cloud :</w:t>
-      </w:r>
-      <w:r>
-        <w:t xml:space="preserve"> </w:t>
-      </w:r>
-      <w:r>
-        <w:t xml:space="preserve">comparaison octet par octet</w:t>
-      </w:r>
-      <w:r>
-        <w:t xml:space="preserve"> </w:t>
-      </w:r>
-      <w:r>
-        <w:t xml:space="preserve">(</w:t>
-      </w:r>
-      <w:r>
-        <w:rPr>
-          <w:rStyle w:val="VerbatimChar"/>
-        </w:rPr>
-        <w:t xml:space="preserve">Content-Length</w:t>
-      </w:r>
-      <w:r>
-        <w:t xml:space="preserve">) avant toute suppression sur le serveur HDS.</w:t>
-      </w:r>
-    </w:p>
-    <w:p>
-      <w:pPr>
-        <w:pStyle w:val="Compact"/>
-        <w:numPr>
-          <w:ilvl w:val="0"/>
-          <w:numId w:val="1007"/>
-        </w:numPr>
-      </w:pPr>
-      <w:r>
-        <w:rPr>
-          <w:b/>
-          <w:bCs/>
-        </w:rPr>
-        <w:t xml:space="preserve">Isolation de sécurité et quarantaine :</w:t>
-      </w:r>
-      <w:r>
-        <w:t xml:space="preserve"> </w:t>
-      </w:r>
-      <w:r>
-        <w:t xml:space="preserve">exclusion absolue des répertoires</w:t>
-      </w:r>
-      <w:r>
-        <w:t xml:space="preserve"> </w:t>
-      </w:r>
-      <w:r>
-        <w:t xml:space="preserve">de quarantaine (</w:t>
-      </w:r>
-      <w:r>
-        <w:rPr>
-          <w:rStyle w:val="VerbatimChar"/>
-        </w:rPr>
-        <w:t xml:space="preserve">_quarantine</w:t>
-      </w:r>
-      <w:r>
-        <w:t xml:space="preserve">) côté client local, interdisant le rapatriement ou</w:t>
-      </w:r>
-      <w:r>
-        <w:t xml:space="preserve"> </w:t>
-      </w:r>
-      <w:r>
-        <w:t xml:space="preserve">l’effacement de fichiers mis à l’isolement sur le cloud.</w:t>
-      </w:r>
-    </w:p>
-    <w:bookmarkEnd w:id="12"/>
+        <w:t xml:space="preserve">Les données de santé transitent exclusivement via l’infrastructure HDS</w:t>
+      </w:r>
+      <w:r>
+        <w:t xml:space="preserve"> </w:t>
+      </w:r>
+      <w:r>
+        <w:t xml:space="preserve">MacroscopiX (05_Audit_Webdav_HDS.md) et utilisent le service</w:t>
+      </w:r>
+      <w:r>
+        <w:t xml:space="preserve"> </w:t>
+      </w:r>
+      <w:r>
+        <w:t xml:space="preserve">MacroscopixSync (06_Audit_Sync_Service.md).</w:t>
+      </w:r>
+    </w:p>
+    <w:p>
+      <w:pPr>
+        <w:pStyle w:val="FirstParagraph"/>
+      </w:pPr>
+      <w:r>
+        <w:t xml:space="preserve">Cette approche permet aux praticiens d’utiliser leurs smartphones</w:t>
+      </w:r>
+      <w:r>
+        <w:t xml:space="preserve"> </w:t>
+      </w:r>
+      <w:r>
+        <w:t xml:space="preserve">tout en assurant la sécurité, la traçabilité et la</w:t>
+      </w:r>
+      <w:r>
+        <w:t xml:space="preserve"> </w:t>
+      </w:r>
+      <w:r>
+        <w:t xml:space="preserve">conformité HDS des données de santé.</w:t>
+      </w:r>
+    </w:p>
     <w:bookmarkEnd w:id="13"/>
-    <w:bookmarkStart w:id="14" w:name="enjeux-et-bénéfices-institutionnels"/>
+    <w:bookmarkStart w:id="15" w:name="X3089b4bd61df99141e5cfd59ef2f545dd9ad2b0"/>
     <w:p>
       <w:pPr>
         <w:pStyle w:val="Heading3"/>
       </w:pPr>
       <w:r>
-        <w:t xml:space="preserve">1.4 Enjeux et bénéfices institutionnels</w:t>
+        <w:t xml:space="preserve">1.4 Contexte clinique et flux de travail multi-modal</w:t>
       </w:r>
     </w:p>
     <w:p>
@@ -1009,18 +848,64 @@
         <w:pStyle w:val="FirstParagraph"/>
       </w:pPr>
       <w:r>
-        <w:t xml:space="preserve">Le déploiement de MacroscopiX répond à plusieurs objectifs stratégiques</w:t>
-      </w:r>
-      <w:r>
-        <w:t xml:space="preserve"> </w:t>
-      </w:r>
-      <w:r>
-        <w:t xml:space="preserve">pour l’établissement :</w:t>
-      </w:r>
-    </w:p>
-    <w:p>
-      <w:pPr>
-        <w:pStyle w:val="Compact"/>
+        <w:t xml:space="preserve">L’application est destinée à être utilisée en</w:t>
+      </w:r>
+      <w:r>
+        <w:t xml:space="preserve"> </w:t>
+      </w:r>
+      <w:r>
+        <w:rPr>
+          <w:b/>
+          <w:bCs/>
+        </w:rPr>
+        <w:t xml:space="preserve">laboratoire d’Anatomie</w:t>
+      </w:r>
+      <w:r>
+        <w:rPr>
+          <w:b/>
+          <w:bCs/>
+        </w:rPr>
+        <w:t xml:space="preserve"> </w:t>
+      </w:r>
+      <w:r>
+        <w:rPr>
+          <w:b/>
+          <w:bCs/>
+        </w:rPr>
+        <w:t xml:space="preserve">et Cytologie Pathologiques (ACP)</w:t>
+      </w:r>
+      <w:r>
+        <w:t xml:space="preserve">, environnement technique contraint</w:t>
+      </w:r>
+      <w:r>
+        <w:t xml:space="preserve"> </w:t>
+      </w:r>
+      <w:r>
+        <w:t xml:space="preserve">(manipulation de formol, port de gants, risques chimiques) nécessitant</w:t>
+      </w:r>
+      <w:r>
+        <w:t xml:space="preserve"> </w:t>
+      </w:r>
+      <w:r>
+        <w:t xml:space="preserve">des outils rapides, robustes et ergonomiques, compatibles avec un usage</w:t>
+      </w:r>
+      <w:r>
+        <w:t xml:space="preserve"> </w:t>
+      </w:r>
+      <w:r>
+        <w:t xml:space="preserve">« sans contact ».</w:t>
+      </w:r>
+    </w:p>
+    <w:p>
+      <w:pPr>
+        <w:pStyle w:val="BodyText"/>
+      </w:pPr>
+      <w:r>
+        <w:t xml:space="preserve">Workflow sécurisé type :</w:t>
+      </w:r>
+    </w:p>
+    <w:p>
+      <w:pPr>
         <w:numPr>
           <w:ilvl w:val="0"/>
           <w:numId w:val="1008"/>
@@ -1031,24 +916,29 @@
           <w:b/>
           <w:bCs/>
         </w:rPr>
-        <w:t xml:space="preserve">Besoin terrain identifié :</w:t>
-      </w:r>
-      <w:r>
-        <w:t xml:space="preserve"> </w:t>
-      </w:r>
-      <w:r>
-        <w:t xml:space="preserve">réponse à un besoin opérationnel réel</w:t>
-      </w:r>
-      <w:r>
-        <w:t xml:space="preserve"> </w:t>
-      </w:r>
-      <w:r>
-        <w:t xml:space="preserve">d’acquisition rapide et standardisée d’images, dictées et documents au poste de travail (paillasse).</w:t>
-      </w:r>
-    </w:p>
-    <w:p>
-      <w:pPr>
-        <w:pStyle w:val="Compact"/>
+        <w:t xml:space="preserve">Identification (entrée)</w:t>
+      </w:r>
+      <w:r>
+        <w:br/>
+      </w:r>
+      <w:r>
+        <w:t xml:space="preserve">Le praticien scanne le code-barres ou le DataMatrix du dossier</w:t>
+      </w:r>
+      <w:r>
+        <w:t xml:space="preserve"> </w:t>
+      </w:r>
+      <w:r>
+        <w:t xml:space="preserve">(numéro d’examen) directement sur la demande d’examen. L’absence de</w:t>
+      </w:r>
+      <w:r>
+        <w:t xml:space="preserve"> </w:t>
+      </w:r>
+      <w:r>
+        <w:t xml:space="preserve">saisie manuelle élimine les risques d’erreurs d’identitovigilance.</w:t>
+      </w:r>
+    </w:p>
+    <w:p>
+      <w:pPr>
         <w:numPr>
           <w:ilvl w:val="0"/>
           <w:numId w:val="1008"/>
@@ -1059,24 +949,101 @@
           <w:b/>
           <w:bCs/>
         </w:rPr>
-        <w:t xml:space="preserve">Mobilité et efficacité :</w:t>
-      </w:r>
-      <w:r>
-        <w:t xml:space="preserve"> </w:t>
-      </w:r>
-      <w:r>
-        <w:t xml:space="preserve">centralisation des flux iconographiques et audio</w:t>
-      </w:r>
-      <w:r>
-        <w:t xml:space="preserve"> </w:t>
-      </w:r>
-      <w:r>
-        <w:t xml:space="preserve">sans infrastructure matérielle lourde ni poste fixe dédié.</w:t>
-      </w:r>
-    </w:p>
-    <w:p>
-      <w:pPr>
-        <w:pStyle w:val="Compact"/>
+        <w:t xml:space="preserve">Acquisition multi-modale</w:t>
+      </w:r>
+      <w:r>
+        <w:t xml:space="preserve"> </w:t>
+      </w:r>
+      <w:r>
+        <w:t xml:space="preserve">:</w:t>
+      </w:r>
+    </w:p>
+    <w:p>
+      <w:pPr>
+        <w:pStyle w:val="Compact"/>
+        <w:numPr>
+          <w:ilvl w:val="1"/>
+          <w:numId w:val="1009"/>
+        </w:numPr>
+      </w:pPr>
+      <w:r>
+        <w:rPr>
+          <w:b/>
+          <w:bCs/>
+        </w:rPr>
+        <w:t xml:space="preserve">Photographies macroscopiques</w:t>
+      </w:r>
+      <w:r>
+        <w:t xml:space="preserve"> </w:t>
+      </w:r>
+      <w:r>
+        <w:t xml:space="preserve">: Clichés haute résolution des pièces opératoires</w:t>
+      </w:r>
+      <w:r>
+        <w:t xml:space="preserve"> </w:t>
+      </w:r>
+      <w:r>
+        <w:t xml:space="preserve">et prélèvements avec recadrage et balance des blancs optimisée.</w:t>
+      </w:r>
+    </w:p>
+    <w:p>
+      <w:pPr>
+        <w:pStyle w:val="Compact"/>
+        <w:numPr>
+          <w:ilvl w:val="1"/>
+          <w:numId w:val="1009"/>
+        </w:numPr>
+      </w:pPr>
+      <w:r>
+        <w:rPr>
+          <w:b/>
+          <w:bCs/>
+        </w:rPr>
+        <w:t xml:space="preserve">Dictaphone intégré</w:t>
+      </w:r>
+      <w:r>
+        <w:t xml:space="preserve"> </w:t>
+      </w:r>
+      <w:r>
+        <w:t xml:space="preserve">: Enregistrement vocal des descriptions macroscopiques</w:t>
+      </w:r>
+      <w:r>
+        <w:t xml:space="preserve"> </w:t>
+      </w:r>
+      <w:r>
+        <w:t xml:space="preserve">(format WAV audio haute fidélité) rattaché au numéro de prélèvement.</w:t>
+      </w:r>
+    </w:p>
+    <w:p>
+      <w:pPr>
+        <w:pStyle w:val="Compact"/>
+        <w:numPr>
+          <w:ilvl w:val="1"/>
+          <w:numId w:val="1009"/>
+        </w:numPr>
+      </w:pPr>
+      <w:r>
+        <w:rPr>
+          <w:b/>
+          <w:bCs/>
+        </w:rPr>
+        <w:t xml:space="preserve">Scanner documentaire</w:t>
+      </w:r>
+      <w:r>
+        <w:t xml:space="preserve"> </w:t>
+      </w:r>
+      <w:r>
+        <w:t xml:space="preserve">: Numérisation des ordonnances, comptes-rendus extérieurs</w:t>
+      </w:r>
+      <w:r>
+        <w:t xml:space="preserve"> </w:t>
+      </w:r>
+      <w:r>
+        <w:t xml:space="preserve">ou feuilles de transmission au format PDF multi-pages.</w:t>
+      </w:r>
+    </w:p>
+    <w:p>
+      <w:pPr>
         <w:numPr>
           <w:ilvl w:val="0"/>
           <w:numId w:val="1008"/>
@@ -1087,24 +1054,23 @@
           <w:b/>
           <w:bCs/>
         </w:rPr>
-        <w:t xml:space="preserve">Rationalisation économique :</w:t>
-      </w:r>
-      <w:r>
-        <w:t xml:space="preserve"> </w:t>
-      </w:r>
-      <w:r>
-        <w:t xml:space="preserve">alternative agile aux caméras sur potence et dictaphones</w:t>
-      </w:r>
-      <w:r>
-        <w:t xml:space="preserve"> </w:t>
-      </w:r>
-      <w:r>
-        <w:t xml:space="preserve">dédiés propriétaires.</w:t>
-      </w:r>
-    </w:p>
-    <w:p>
-      <w:pPr>
-        <w:pStyle w:val="Compact"/>
+        <w:t xml:space="preserve">Transfert (sortie)</w:t>
+      </w:r>
+      <w:r>
+        <w:br/>
+      </w:r>
+      <w:r>
+        <w:t xml:space="preserve">Envoi immédiat et automatique des fichiers vers le serveur sécurisé WebDAV HDS</w:t>
+      </w:r>
+      <w:r>
+        <w:t xml:space="preserve"> </w:t>
+      </w:r>
+      <w:r>
+        <w:t xml:space="preserve">(timeouts réseau configurés à 120s pour résister aux liaisons hospitalières instables).</w:t>
+      </w:r>
+    </w:p>
+    <w:p>
+      <w:pPr>
         <w:numPr>
           <w:ilvl w:val="0"/>
           <w:numId w:val="1008"/>
@@ -1115,27 +1081,454 @@
           <w:b/>
           <w:bCs/>
         </w:rPr>
-        <w:t xml:space="preserve">Encadrement des pratiques (Shadow IT) :</w:t>
-      </w:r>
-      <w:r>
-        <w:t xml:space="preserve"> </w:t>
-      </w:r>
-      <w:r>
-        <w:t xml:space="preserve">sécurisation et</w:t>
-      </w:r>
-      <w:r>
-        <w:t xml:space="preserve"> </w:t>
-      </w:r>
-      <w:r>
-        <w:t xml:space="preserve">formalisation d’usages existants dans un cadre validé par la DSI et le RSSI.</w:t>
-      </w:r>
-    </w:p>
-    <w:p>
-      <w:pPr>
-        <w:pStyle w:val="Compact"/>
+        <w:t xml:space="preserve">Purge immédiate</w:t>
+      </w:r>
+      <w:r>
+        <w:br/>
+      </w:r>
+      <w:r>
+        <w:t xml:space="preserve">Suppression automatique et irréversible des fichiers de la mémoire vive et du cache</w:t>
+      </w:r>
+      <w:r>
+        <w:t xml:space="preserve"> </w:t>
+      </w:r>
+      <w:r>
+        <w:t xml:space="preserve">chiffré du terminal dès réception de l’acquittement HTTP 201/204 du serveur.</w:t>
+      </w:r>
+    </w:p>
+    <w:p>
+      <w:pPr>
         <w:numPr>
           <w:ilvl w:val="0"/>
           <w:numId w:val="1008"/>
+        </w:numPr>
+      </w:pPr>
+      <w:r>
+        <w:rPr>
+          <w:b/>
+          <w:bCs/>
+        </w:rPr>
+        <w:t xml:space="preserve">Aiguillage et intégration au SI hospitalier</w:t>
+      </w:r>
+      <w:r>
+        <w:br/>
+      </w:r>
+      <w:r>
+        <w:t xml:space="preserve">L’agent local MacroscopixSync rapatrie les fichiers et les achemine vers les répertoires</w:t>
+      </w:r>
+      <w:r>
+        <w:t xml:space="preserve"> </w:t>
+      </w:r>
+      <w:r>
+        <w:t xml:space="preserve">cibles appropriés du Système de Gestion de Laboratoire (SGL) / NAS :</w:t>
+      </w:r>
+    </w:p>
+    <w:p>
+      <w:pPr>
+        <w:pStyle w:val="Compact"/>
+        <w:numPr>
+          <w:ilvl w:val="1"/>
+          <w:numId w:val="1010"/>
+        </w:numPr>
+      </w:pPr>
+      <w:r>
+        <w:t xml:space="preserve">Dossier Images : Répertoire racine configuré (</w:t>
+      </w:r>
+      <w:r>
+        <w:rPr>
+          <w:rStyle w:val="VerbatimChar"/>
+        </w:rPr>
+        <w:t xml:space="preserve">LocalPath</w:t>
+      </w:r>
+      <w:r>
+        <w:t xml:space="preserve">).</w:t>
+      </w:r>
+    </w:p>
+    <w:p>
+      <w:pPr>
+        <w:pStyle w:val="Compact"/>
+        <w:numPr>
+          <w:ilvl w:val="1"/>
+          <w:numId w:val="1010"/>
+        </w:numPr>
+      </w:pPr>
+      <w:r>
+        <w:t xml:space="preserve">Dossier Documents PDF : Répertoire dédié (</w:t>
+      </w:r>
+      <w:r>
+        <w:rPr>
+          <w:rStyle w:val="VerbatimChar"/>
+        </w:rPr>
+        <w:t xml:space="preserve">PdfLocalPath</w:t>
+      </w:r>
+      <w:r>
+        <w:t xml:space="preserve">).</w:t>
+      </w:r>
+    </w:p>
+    <w:p>
+      <w:pPr>
+        <w:pStyle w:val="Compact"/>
+        <w:numPr>
+          <w:ilvl w:val="1"/>
+          <w:numId w:val="1010"/>
+        </w:numPr>
+      </w:pPr>
+      <w:r>
+        <w:t xml:space="preserve">Dossier Audio : Répertoire de dictée (</w:t>
+      </w:r>
+      <w:r>
+        <w:rPr>
+          <w:rStyle w:val="VerbatimChar"/>
+        </w:rPr>
+        <w:t xml:space="preserve">AudioLocalPath</w:t>
+      </w:r>
+      <w:r>
+        <w:t xml:space="preserve">), avec normalisation automatique</w:t>
+      </w:r>
+      <w:r>
+        <w:t xml:space="preserve"> </w:t>
+      </w:r>
+      <w:r>
+        <w:t xml:space="preserve">des sous-dossiers (suppression des underscores type</w:t>
+      </w:r>
+      <w:r>
+        <w:t xml:space="preserve"> </w:t>
+      </w:r>
+      <w:r>
+        <w:rPr>
+          <w:rStyle w:val="VerbatimChar"/>
+        </w:rPr>
+        <w:t xml:space="preserve">DossierPrelevement</w:t>
+      </w:r>
+      <w:r>
+        <w:t xml:space="preserve"> </w:t>
+      </w:r>
+      <w:r>
+        <w:t xml:space="preserve">pour compatibilité</w:t>
+      </w:r>
+      <w:r>
+        <w:t xml:space="preserve"> </w:t>
+      </w:r>
+      <w:r>
+        <w:t xml:space="preserve">avec les logiciels de transcription médicale).</w:t>
+      </w:r>
+    </w:p>
+    <w:bookmarkStart w:id="14" w:name="objectifs-de-sécurité-majeurs"/>
+    <w:p>
+      <w:pPr>
+        <w:pStyle w:val="Heading4"/>
+      </w:pPr>
+      <w:r>
+        <w:t xml:space="preserve">Objectifs de sécurité majeurs</w:t>
+      </w:r>
+    </w:p>
+    <w:p>
+      <w:pPr>
+        <w:pStyle w:val="Compact"/>
+        <w:numPr>
+          <w:ilvl w:val="0"/>
+          <w:numId w:val="1011"/>
+        </w:numPr>
+      </w:pPr>
+      <w:r>
+        <w:rPr>
+          <w:b/>
+          <w:bCs/>
+        </w:rPr>
+        <w:t xml:space="preserve">Zéro persistance :</w:t>
+      </w:r>
+      <w:r>
+        <w:t xml:space="preserve"> </w:t>
+      </w:r>
+      <w:r>
+        <w:t xml:space="preserve">aucune donnée de santé n’est conservée sur le</w:t>
+      </w:r>
+      <w:r>
+        <w:t xml:space="preserve"> </w:t>
+      </w:r>
+      <w:r>
+        <w:t xml:space="preserve">terminal mobile après le transfert.</w:t>
+      </w:r>
+    </w:p>
+    <w:p>
+      <w:pPr>
+        <w:pStyle w:val="Compact"/>
+        <w:numPr>
+          <w:ilvl w:val="0"/>
+          <w:numId w:val="1011"/>
+        </w:numPr>
+      </w:pPr>
+      <w:r>
+        <w:rPr>
+          <w:b/>
+          <w:bCs/>
+        </w:rPr>
+        <w:t xml:space="preserve">Cloisonnement strict :</w:t>
+      </w:r>
+      <w:r>
+        <w:t xml:space="preserve"> </w:t>
+      </w:r>
+      <w:r>
+        <w:t xml:space="preserve">séparation physique et logique entre les</w:t>
+      </w:r>
+      <w:r>
+        <w:t xml:space="preserve"> </w:t>
+      </w:r>
+      <w:r>
+        <w:t xml:space="preserve">flux d’administration (FastAPI / PHP) et les flux de données de santé (WebDAV HDS / S3).</w:t>
+      </w:r>
+    </w:p>
+    <w:p>
+      <w:pPr>
+        <w:pStyle w:val="Compact"/>
+        <w:numPr>
+          <w:ilvl w:val="0"/>
+          <w:numId w:val="1011"/>
+        </w:numPr>
+      </w:pPr>
+      <w:r>
+        <w:rPr>
+          <w:b/>
+          <w:bCs/>
+        </w:rPr>
+        <w:t xml:space="preserve">Intégrité et confidentialité :</w:t>
+      </w:r>
+      <w:r>
+        <w:t xml:space="preserve"> </w:t>
+      </w:r>
+      <w:r>
+        <w:t xml:space="preserve">chiffrement des flux réseau de bout</w:t>
+      </w:r>
+      <w:r>
+        <w:t xml:space="preserve"> </w:t>
+      </w:r>
+      <w:r>
+        <w:t xml:space="preserve">en bout (TLS ≥ 1.2, TLS 1.3 privilégié).</w:t>
+      </w:r>
+    </w:p>
+    <w:p>
+      <w:pPr>
+        <w:pStyle w:val="Compact"/>
+        <w:numPr>
+          <w:ilvl w:val="0"/>
+          <w:numId w:val="1011"/>
+        </w:numPr>
+      </w:pPr>
+      <w:r>
+        <w:rPr>
+          <w:b/>
+          <w:bCs/>
+        </w:rPr>
+        <w:t xml:space="preserve">Contrôle d’intégrité strict avant purge cloud :</w:t>
+      </w:r>
+      <w:r>
+        <w:t xml:space="preserve"> </w:t>
+      </w:r>
+      <w:r>
+        <w:t xml:space="preserve">comparaison octet par octet</w:t>
+      </w:r>
+      <w:r>
+        <w:t xml:space="preserve"> </w:t>
+      </w:r>
+      <w:r>
+        <w:t xml:space="preserve">(</w:t>
+      </w:r>
+      <w:r>
+        <w:rPr>
+          <w:rStyle w:val="VerbatimChar"/>
+        </w:rPr>
+        <w:t xml:space="preserve">Content-Length</w:t>
+      </w:r>
+      <w:r>
+        <w:t xml:space="preserve">) avant toute suppression sur le serveur HDS.</w:t>
+      </w:r>
+    </w:p>
+    <w:p>
+      <w:pPr>
+        <w:pStyle w:val="Compact"/>
+        <w:numPr>
+          <w:ilvl w:val="0"/>
+          <w:numId w:val="1011"/>
+        </w:numPr>
+      </w:pPr>
+      <w:r>
+        <w:rPr>
+          <w:b/>
+          <w:bCs/>
+        </w:rPr>
+        <w:t xml:space="preserve">Isolation de sécurité et quarantaine :</w:t>
+      </w:r>
+      <w:r>
+        <w:t xml:space="preserve"> </w:t>
+      </w:r>
+      <w:r>
+        <w:t xml:space="preserve">exclusion absolue des répertoires</w:t>
+      </w:r>
+      <w:r>
+        <w:t xml:space="preserve"> </w:t>
+      </w:r>
+      <w:r>
+        <w:t xml:space="preserve">de quarantaine (</w:t>
+      </w:r>
+      <w:r>
+        <w:rPr>
+          <w:rStyle w:val="VerbatimChar"/>
+        </w:rPr>
+        <w:t xml:space="preserve">_quarantine</w:t>
+      </w:r>
+      <w:r>
+        <w:t xml:space="preserve">) côté client local, interdisant le rapatriement ou</w:t>
+      </w:r>
+      <w:r>
+        <w:t xml:space="preserve"> </w:t>
+      </w:r>
+      <w:r>
+        <w:t xml:space="preserve">l’effacement de fichiers mis à l’isolement sur le cloud.</w:t>
+      </w:r>
+    </w:p>
+    <w:bookmarkEnd w:id="14"/>
+    <w:bookmarkEnd w:id="15"/>
+    <w:bookmarkStart w:id="16" w:name="enjeux-et-bénéfices-institutionnels"/>
+    <w:p>
+      <w:pPr>
+        <w:pStyle w:val="Heading3"/>
+      </w:pPr>
+      <w:r>
+        <w:t xml:space="preserve">1.5 Enjeux et bénéfices institutionnels</w:t>
+      </w:r>
+    </w:p>
+    <w:p>
+      <w:pPr>
+        <w:pStyle w:val="FirstParagraph"/>
+      </w:pPr>
+      <w:r>
+        <w:t xml:space="preserve">Le déploiement de MacroscopiX répond à plusieurs objectifs stratégiques</w:t>
+      </w:r>
+      <w:r>
+        <w:t xml:space="preserve"> </w:t>
+      </w:r>
+      <w:r>
+        <w:t xml:space="preserve">pour l’établissement :</w:t>
+      </w:r>
+    </w:p>
+    <w:p>
+      <w:pPr>
+        <w:pStyle w:val="Compact"/>
+        <w:numPr>
+          <w:ilvl w:val="0"/>
+          <w:numId w:val="1012"/>
+        </w:numPr>
+      </w:pPr>
+      <w:r>
+        <w:rPr>
+          <w:b/>
+          <w:bCs/>
+        </w:rPr>
+        <w:t xml:space="preserve">Besoin terrain identifié :</w:t>
+      </w:r>
+      <w:r>
+        <w:t xml:space="preserve"> </w:t>
+      </w:r>
+      <w:r>
+        <w:t xml:space="preserve">réponse à un besoin opérationnel réel</w:t>
+      </w:r>
+      <w:r>
+        <w:t xml:space="preserve"> </w:t>
+      </w:r>
+      <w:r>
+        <w:t xml:space="preserve">d’acquisition rapide et standardisée d’images, dictées et documents au poste de travail (paillasse).</w:t>
+      </w:r>
+    </w:p>
+    <w:p>
+      <w:pPr>
+        <w:pStyle w:val="Compact"/>
+        <w:numPr>
+          <w:ilvl w:val="0"/>
+          <w:numId w:val="1012"/>
+        </w:numPr>
+      </w:pPr>
+      <w:r>
+        <w:rPr>
+          <w:b/>
+          <w:bCs/>
+        </w:rPr>
+        <w:t xml:space="preserve">Mobilité et efficacité :</w:t>
+      </w:r>
+      <w:r>
+        <w:t xml:space="preserve"> </w:t>
+      </w:r>
+      <w:r>
+        <w:t xml:space="preserve">centralisation des flux iconographiques et audio</w:t>
+      </w:r>
+      <w:r>
+        <w:t xml:space="preserve"> </w:t>
+      </w:r>
+      <w:r>
+        <w:t xml:space="preserve">sans infrastructure matérielle lourde ni poste fixe dédié.</w:t>
+      </w:r>
+    </w:p>
+    <w:p>
+      <w:pPr>
+        <w:pStyle w:val="Compact"/>
+        <w:numPr>
+          <w:ilvl w:val="0"/>
+          <w:numId w:val="1012"/>
+        </w:numPr>
+      </w:pPr>
+      <w:r>
+        <w:rPr>
+          <w:b/>
+          <w:bCs/>
+        </w:rPr>
+        <w:t xml:space="preserve">Rationalisation économique :</w:t>
+      </w:r>
+      <w:r>
+        <w:t xml:space="preserve"> </w:t>
+      </w:r>
+      <w:r>
+        <w:t xml:space="preserve">alternative agile aux caméras sur potence et dictaphones</w:t>
+      </w:r>
+      <w:r>
+        <w:t xml:space="preserve"> </w:t>
+      </w:r>
+      <w:r>
+        <w:t xml:space="preserve">dédiés propriétaires.</w:t>
+      </w:r>
+    </w:p>
+    <w:p>
+      <w:pPr>
+        <w:pStyle w:val="Compact"/>
+        <w:numPr>
+          <w:ilvl w:val="0"/>
+          <w:numId w:val="1012"/>
+        </w:numPr>
+      </w:pPr>
+      <w:r>
+        <w:rPr>
+          <w:b/>
+          <w:bCs/>
+        </w:rPr>
+        <w:t xml:space="preserve">Encadrement des pratiques (Shadow IT) :</w:t>
+      </w:r>
+      <w:r>
+        <w:t xml:space="preserve"> </w:t>
+      </w:r>
+      <w:r>
+        <w:t xml:space="preserve">sécurisation et</w:t>
+      </w:r>
+      <w:r>
+        <w:t xml:space="preserve"> </w:t>
+      </w:r>
+      <w:r>
+        <w:t xml:space="preserve">formalisation d’usages existants dans un cadre validé par la DSI et le RSSI.</w:t>
+      </w:r>
+    </w:p>
+    <w:p>
+      <w:pPr>
+        <w:pStyle w:val="Compact"/>
+        <w:numPr>
+          <w:ilvl w:val="0"/>
+          <w:numId w:val="1012"/>
         </w:numPr>
       </w:pPr>
       <w:r>
@@ -1165,9 +1558,9 @@
         </w:pict>
       </w:r>
     </w:p>
-    <w:bookmarkEnd w:id="14"/>
-    <w:bookmarkEnd w:id="15"/>
-    <w:bookmarkStart w:id="19" w:name="Xbe4343c655ecf4695522337c8bb635581952559"/>
+    <w:bookmarkEnd w:id="16"/>
+    <w:bookmarkEnd w:id="17"/>
+    <w:bookmarkStart w:id="21" w:name="Xbe4343c655ecf4695522337c8bb635581952559"/>
     <w:p>
       <w:pPr>
         <w:pStyle w:val="Heading2"/>
@@ -1206,7 +1599,7 @@
         <w:t xml:space="preserve">entre la gestion administrative et le traitement des données de santé.</w:t>
       </w:r>
     </w:p>
-    <w:bookmarkStart w:id="16" w:name="structuration-en-zones-distinctes"/>
+    <w:bookmarkStart w:id="18" w:name="structuration-en-zones-distinctes"/>
     <w:p>
       <w:pPr>
         <w:pStyle w:val="Heading3"/>
@@ -1227,7 +1620,7 @@
       <w:pPr>
         <w:numPr>
           <w:ilvl w:val="0"/>
-          <w:numId w:val="1009"/>
+          <w:numId w:val="1013"/>
         </w:numPr>
       </w:pPr>
       <w:r>
@@ -1272,7 +1665,7 @@
       <w:pPr>
         <w:numPr>
           <w:ilvl w:val="0"/>
-          <w:numId w:val="1009"/>
+          <w:numId w:val="1013"/>
         </w:numPr>
       </w:pPr>
       <w:r>
@@ -1347,8 +1740,8 @@
         <w:pStyle w:val="FirstParagraph"/>
       </w:pPr>
     </w:p>
-    <w:bookmarkEnd w:id="16"/>
-    <w:bookmarkStart w:id="17" w:name="X7e2479a163279e9b796aebf1695407411f6b21c"/>
+    <w:bookmarkEnd w:id="18"/>
+    <w:bookmarkStart w:id="19" w:name="X7e2479a163279e9b796aebf1695407411f6b21c"/>
     <w:p>
       <w:pPr>
         <w:pStyle w:val="Heading3"/>
@@ -1375,7 +1768,7 @@
       <w:pPr>
         <w:numPr>
           <w:ilvl w:val="0"/>
-          <w:numId w:val="1010"/>
+          <w:numId w:val="1014"/>
         </w:numPr>
       </w:pPr>
       <w:r>
@@ -1424,7 +1817,7 @@
       <w:pPr>
         <w:numPr>
           <w:ilvl w:val="0"/>
-          <w:numId w:val="1010"/>
+          <w:numId w:val="1014"/>
         </w:numPr>
       </w:pPr>
       <w:r>
@@ -1458,7 +1851,7 @@
         <w:pStyle w:val="Compact"/>
         <w:numPr>
           <w:ilvl w:val="1"/>
-          <w:numId w:val="1011"/>
+          <w:numId w:val="1015"/>
         </w:numPr>
       </w:pPr>
       <w:r>
@@ -1492,7 +1885,7 @@
         <w:pStyle w:val="Compact"/>
         <w:numPr>
           <w:ilvl w:val="1"/>
-          <w:numId w:val="1011"/>
+          <w:numId w:val="1015"/>
         </w:numPr>
       </w:pPr>
       <w:r>
@@ -1511,8 +1904,8 @@
         <w:t xml:space="preserve">entièrement à la DSI du CHU.</w:t>
       </w:r>
     </w:p>
-    <w:bookmarkEnd w:id="17"/>
-    <w:bookmarkStart w:id="18" w:name="X56cc60b839fdbea1cb0d7cbc52145be870f7079"/>
+    <w:bookmarkEnd w:id="19"/>
+    <w:bookmarkStart w:id="20" w:name="X56cc60b839fdbea1cb0d7cbc52145be870f7079"/>
     <w:p>
       <w:pPr>
         <w:pStyle w:val="Heading3"/>
@@ -1525,7 +1918,7 @@
       <w:pPr>
         <w:numPr>
           <w:ilvl w:val="0"/>
-          <w:numId w:val="1012"/>
+          <w:numId w:val="1016"/>
         </w:numPr>
       </w:pPr>
       <w:r>
@@ -1558,7 +1951,7 @@
       <w:pPr>
         <w:numPr>
           <w:ilvl w:val="0"/>
-          <w:numId w:val="1012"/>
+          <w:numId w:val="1016"/>
         </w:numPr>
       </w:pPr>
       <w:r>
@@ -1609,9 +2002,9 @@
         </w:pict>
       </w:r>
     </w:p>
-    <w:bookmarkEnd w:id="18"/>
-    <w:bookmarkEnd w:id="19"/>
-    <w:bookmarkStart w:id="20" w:name="matrice-des-flux-et-des-ports"/>
+    <w:bookmarkEnd w:id="20"/>
+    <w:bookmarkEnd w:id="21"/>
+    <w:bookmarkStart w:id="22" w:name="matrice-des-flux-et-des-ports"/>
     <w:p>
       <w:pPr>
         <w:pStyle w:val="Heading2"/>
@@ -2105,8 +2498,8 @@
         </w:pict>
       </w:r>
     </w:p>
-    <w:bookmarkEnd w:id="20"/>
-    <w:bookmarkStart w:id="26" w:name="mesures-de-sécurité-mises-en-œuvre"/>
+    <w:bookmarkEnd w:id="22"/>
+    <w:bookmarkStart w:id="28" w:name="mesures-de-sécurité-mises-en-œuvre"/>
     <w:p>
       <w:pPr>
         <w:pStyle w:val="Heading2"/>
@@ -2115,7 +2508,7 @@
         <w:t xml:space="preserve">4. Mesures de sécurité mises en œuvre</w:t>
       </w:r>
     </w:p>
-    <w:bookmarkStart w:id="21" w:name="sécurité-sur-le-terminal-mobile"/>
+    <w:bookmarkStart w:id="23" w:name="sécurité-sur-le-terminal-mobile"/>
     <w:p>
       <w:pPr>
         <w:pStyle w:val="Heading3"/>
@@ -2129,7 +2522,7 @@
         <w:pStyle w:val="Compact"/>
         <w:numPr>
           <w:ilvl w:val="0"/>
-          <w:numId w:val="1013"/>
+          <w:numId w:val="1017"/>
         </w:numPr>
       </w:pPr>
       <w:r>
@@ -2157,7 +2550,7 @@
         <w:pStyle w:val="Compact"/>
         <w:numPr>
           <w:ilvl w:val="0"/>
-          <w:numId w:val="1013"/>
+          <w:numId w:val="1017"/>
         </w:numPr>
       </w:pPr>
       <w:r>
@@ -2179,7 +2572,7 @@
         <w:pStyle w:val="Compact"/>
         <w:numPr>
           <w:ilvl w:val="0"/>
-          <w:numId w:val="1013"/>
+          <w:numId w:val="1017"/>
         </w:numPr>
       </w:pPr>
       <w:r>
@@ -2207,7 +2600,7 @@
         <w:pStyle w:val="Compact"/>
         <w:numPr>
           <w:ilvl w:val="0"/>
-          <w:numId w:val="1013"/>
+          <w:numId w:val="1017"/>
         </w:numPr>
       </w:pPr>
       <w:r>
@@ -2235,7 +2628,7 @@
         <w:pStyle w:val="Compact"/>
         <w:numPr>
           <w:ilvl w:val="0"/>
-          <w:numId w:val="1013"/>
+          <w:numId w:val="1017"/>
         </w:numPr>
       </w:pPr>
       <w:r>
@@ -2257,7 +2650,7 @@
         <w:pStyle w:val="Compact"/>
         <w:numPr>
           <w:ilvl w:val="0"/>
-          <w:numId w:val="1013"/>
+          <w:numId w:val="1017"/>
         </w:numPr>
       </w:pPr>
       <w:r>
@@ -2280,246 +2673,14 @@
         <w:t xml:space="preserve">de fichiers volumineux (PDF multi-pages, audio WAV) sans corruption.</w:t>
       </w:r>
     </w:p>
-    <w:bookmarkEnd w:id="21"/>
-    <w:bookmarkStart w:id="22" w:name="sécurité-des-communications"/>
+    <w:bookmarkEnd w:id="23"/>
+    <w:bookmarkStart w:id="24" w:name="sécurité-des-communications"/>
     <w:p>
       <w:pPr>
         <w:pStyle w:val="Heading3"/>
       </w:pPr>
       <w:r>
         <w:t xml:space="preserve">4.2 Sécurité des communications</w:t>
-      </w:r>
-    </w:p>
-    <w:p>
-      <w:pPr>
-        <w:pStyle w:val="Compact"/>
-        <w:numPr>
-          <w:ilvl w:val="0"/>
-          <w:numId w:val="1014"/>
-        </w:numPr>
-      </w:pPr>
-      <w:r>
-        <w:rPr>
-          <w:b/>
-          <w:bCs/>
-        </w:rPr>
-        <w:t xml:space="preserve">Chiffrement TLS 1.3</w:t>
-      </w:r>
-      <w:r>
-        <w:t xml:space="preserve"> </w:t>
-      </w:r>
-      <w:r>
-        <w:t xml:space="preserve">(TLS 1.2 minimum avec suites cryptographiques robustes).</w:t>
-      </w:r>
-    </w:p>
-    <w:p>
-      <w:pPr>
-        <w:pStyle w:val="Compact"/>
-        <w:numPr>
-          <w:ilvl w:val="0"/>
-          <w:numId w:val="1014"/>
-        </w:numPr>
-      </w:pPr>
-      <w:r>
-        <w:rPr>
-          <w:b/>
-          <w:bCs/>
-        </w:rPr>
-        <w:t xml:space="preserve">Authentification forte :</w:t>
-      </w:r>
-      <w:r>
-        <w:t xml:space="preserve"> </w:t>
-      </w:r>
-      <w:r>
-        <w:t xml:space="preserve">Jeton unique par terminal avec liaison matérielle au</w:t>
-      </w:r>
-      <w:r>
-        <w:t xml:space="preserve"> </w:t>
-      </w:r>
-      <w:r>
-        <w:rPr>
-          <w:rStyle w:val="VerbatimChar"/>
-        </w:rPr>
-        <w:t xml:space="preserve">device_uuid</w:t>
-      </w:r>
-      <w:r>
-        <w:t xml:space="preserve">.</w:t>
-      </w:r>
-    </w:p>
-    <w:p>
-      <w:pPr>
-        <w:pStyle w:val="Compact"/>
-        <w:numPr>
-          <w:ilvl w:val="0"/>
-          <w:numId w:val="1014"/>
-        </w:numPr>
-      </w:pPr>
-      <w:r>
-        <w:rPr>
-          <w:b/>
-          <w:bCs/>
-        </w:rPr>
-        <w:t xml:space="preserve">Validation SSL stricte :</w:t>
-      </w:r>
-      <w:r>
-        <w:t xml:space="preserve"> </w:t>
-      </w:r>
-      <w:r>
-        <w:t xml:space="preserve">Vérification systématique de la chaîne de certification.</w:t>
-      </w:r>
-    </w:p>
-    <w:bookmarkEnd w:id="22"/>
-    <w:bookmarkStart w:id="23" w:name="hébergement-et-stockage-hds"/>
-    <w:p>
-      <w:pPr>
-        <w:pStyle w:val="Heading3"/>
-      </w:pPr>
-      <w:r>
-        <w:t xml:space="preserve">4.3 Hébergement et stockage HDS</w:t>
-      </w:r>
-    </w:p>
-    <w:p>
-      <w:pPr>
-        <w:pStyle w:val="Compact"/>
-        <w:numPr>
-          <w:ilvl w:val="0"/>
-          <w:numId w:val="1015"/>
-        </w:numPr>
-      </w:pPr>
-      <w:r>
-        <w:rPr>
-          <w:b/>
-          <w:bCs/>
-        </w:rPr>
-        <w:t xml:space="preserve">Zone HDS multi-fournisseurs français :</w:t>
-      </w:r>
-    </w:p>
-    <w:p>
-      <w:pPr>
-        <w:pStyle w:val="Compact"/>
-        <w:numPr>
-          <w:ilvl w:val="1"/>
-          <w:numId w:val="1016"/>
-        </w:numPr>
-      </w:pPr>
-      <w:r>
-        <w:rPr>
-          <w:b/>
-          <w:bCs/>
-        </w:rPr>
-        <w:t xml:space="preserve">Serveur WebDAV (compute)</w:t>
-      </w:r>
-      <w:r>
-        <w:t xml:space="preserve"> </w:t>
-      </w:r>
-      <w:r>
-        <w:t xml:space="preserve">: hébergé chez Scalingo (certifié HDS et ISO 27001).</w:t>
-      </w:r>
-    </w:p>
-    <w:p>
-      <w:pPr>
-        <w:pStyle w:val="Compact"/>
-        <w:numPr>
-          <w:ilvl w:val="1"/>
-          <w:numId w:val="1016"/>
-        </w:numPr>
-      </w:pPr>
-      <w:r>
-        <w:rPr>
-          <w:b/>
-          <w:bCs/>
-        </w:rPr>
-        <w:t xml:space="preserve">Stockage objet (S3)</w:t>
-      </w:r>
-      <w:r>
-        <w:t xml:space="preserve"> </w:t>
-      </w:r>
-      <w:r>
-        <w:t xml:space="preserve">: hébergé chez Hosteur (certifié HDS et ISO 27001).</w:t>
-      </w:r>
-    </w:p>
-    <w:p>
-      <w:pPr>
-        <w:pStyle w:val="Compact"/>
-        <w:numPr>
-          <w:ilvl w:val="0"/>
-          <w:numId w:val="1015"/>
-        </w:numPr>
-      </w:pPr>
-      <w:r>
-        <w:rPr>
-          <w:b/>
-          <w:bCs/>
-        </w:rPr>
-        <w:t xml:space="preserve">Chiffrement au repos :</w:t>
-      </w:r>
-      <w:r>
-        <w:t xml:space="preserve"> </w:t>
-      </w:r>
-      <w:r>
-        <w:t xml:space="preserve">Chiffrement natif AES-256 (SSE-S3).</w:t>
-      </w:r>
-    </w:p>
-    <w:p>
-      <w:pPr>
-        <w:pStyle w:val="Compact"/>
-        <w:numPr>
-          <w:ilvl w:val="0"/>
-          <w:numId w:val="1015"/>
-        </w:numPr>
-      </w:pPr>
-      <w:r>
-        <w:rPr>
-          <w:b/>
-          <w:bCs/>
-        </w:rPr>
-        <w:t xml:space="preserve">Isolation logique forte :</w:t>
-      </w:r>
-    </w:p>
-    <w:p>
-      <w:pPr>
-        <w:pStyle w:val="Compact"/>
-        <w:numPr>
-          <w:ilvl w:val="1"/>
-          <w:numId w:val="1017"/>
-        </w:numPr>
-      </w:pPr>
-      <w:r>
-        <w:t xml:space="preserve">Un dossier racine dédié et étanche par établissement.</w:t>
-      </w:r>
-    </w:p>
-    <w:p>
-      <w:pPr>
-        <w:pStyle w:val="Compact"/>
-        <w:numPr>
-          <w:ilvl w:val="1"/>
-          <w:numId w:val="1017"/>
-        </w:numPr>
-      </w:pPr>
-      <w:r>
-        <w:t xml:space="preserve">Un jeton WebDAV unique par dossier racine.</w:t>
-      </w:r>
-    </w:p>
-    <w:p>
-      <w:pPr>
-        <w:pStyle w:val="Compact"/>
-        <w:numPr>
-          <w:ilvl w:val="1"/>
-          <w:numId w:val="1017"/>
-        </w:numPr>
-      </w:pPr>
-      <w:r>
-        <w:t xml:space="preserve">Rejet des accès croisés.</w:t>
-      </w:r>
-    </w:p>
-    <w:bookmarkEnd w:id="23"/>
-    <w:bookmarkStart w:id="24" w:name="dispositif-de-quarantaine-et-intégrité"/>
-    <w:p>
-      <w:pPr>
-        <w:pStyle w:val="Heading3"/>
-      </w:pPr>
-      <w:r>
-        <w:t xml:space="preserve">4.4 Dispositif de Quarantaine et Intégrité</w:t>
       </w:r>
     </w:p>
     <w:p>
@@ -2535,31 +2696,13 @@
           <w:b/>
           <w:bCs/>
         </w:rPr>
-        <w:t xml:space="preserve">Gestion des fichiers suspects (Quarantaine serveur) :</w:t>
-      </w:r>
-      <w:r>
-        <w:t xml:space="preserve"> </w:t>
-      </w:r>
-      <w:r>
-        <w:t xml:space="preserve">Les fichiers identifiés comme</w:t>
-      </w:r>
-      <w:r>
-        <w:t xml:space="preserve"> </w:t>
-      </w:r>
-      <w:r>
-        <w:t xml:space="preserve">anormaux par les contrôles d’intégrité cloud sont déplacés dans un dossier isolé</w:t>
-      </w:r>
-      <w:r>
-        <w:t xml:space="preserve"> </w:t>
-      </w:r>
-      <w:r>
-        <w:rPr>
-          <w:rStyle w:val="VerbatimChar"/>
-        </w:rPr>
-        <w:t xml:space="preserve">_quarantine</w:t>
-      </w:r>
-      <w:r>
-        <w:t xml:space="preserve">.</w:t>
+        <w:t xml:space="preserve">Chiffrement TLS 1.3</w:t>
+      </w:r>
+      <w:r>
+        <w:t xml:space="preserve"> </w:t>
+      </w:r>
+      <w:r>
+        <w:t xml:space="preserve">(TLS 1.2 minimum avec suites cryptographiques robustes).</w:t>
       </w:r>
     </w:p>
     <w:p>
@@ -2575,13 +2718,13 @@
           <w:b/>
           <w:bCs/>
         </w:rPr>
-        <w:t xml:space="preserve">Exclusion stricte côté agent local :</w:t>
-      </w:r>
-      <w:r>
-        <w:t xml:space="preserve"> </w:t>
-      </w:r>
-      <w:r>
-        <w:t xml:space="preserve">L’agent Windows</w:t>
+        <w:t xml:space="preserve">Authentification forte :</w:t>
+      </w:r>
+      <w:r>
+        <w:t xml:space="preserve"> </w:t>
+      </w:r>
+      <w:r>
+        <w:t xml:space="preserve">Jeton unique par terminal avec liaison matérielle au</w:t>
       </w:r>
       <w:r>
         <w:t xml:space="preserve"> </w:t>
@@ -2590,52 +2733,10 @@
         <w:rPr>
           <w:rStyle w:val="VerbatimChar"/>
         </w:rPr>
-        <w:t xml:space="preserve">MacroscopixSync</w:t>
-      </w:r>
-      <w:r>
-        <w:t xml:space="preserve"> </w:t>
-      </w:r>
-      <w:r>
-        <w:t xml:space="preserve">filtre et ignore</w:t>
-      </w:r>
-      <w:r>
-        <w:t xml:space="preserve"> </w:t>
-      </w:r>
-      <w:r>
-        <w:t xml:space="preserve">rigoureusement tout dossier ou fichier contenant</w:t>
-      </w:r>
-      <w:r>
-        <w:t xml:space="preserve"> </w:t>
-      </w:r>
-      <w:r>
-        <w:rPr>
-          <w:rStyle w:val="VerbatimChar"/>
-        </w:rPr>
-        <w:t xml:space="preserve">quarantine</w:t>
-      </w:r>
-      <w:r>
-        <w:t xml:space="preserve"> </w:t>
-      </w:r>
-      <w:r>
-        <w:t xml:space="preserve">ou</w:t>
-      </w:r>
-      <w:r>
-        <w:t xml:space="preserve"> </w:t>
-      </w:r>
-      <w:r>
-        <w:rPr>
-          <w:rStyle w:val="VerbatimChar"/>
-        </w:rPr>
-        <w:t xml:space="preserve">_quarantine</w:t>
-      </w:r>
-      <w:r>
-        <w:t xml:space="preserve">. Ces fichiers ne sont</w:t>
-      </w:r>
-      <w:r>
-        <w:t xml:space="preserve"> </w:t>
-      </w:r>
-      <w:r>
-        <w:t xml:space="preserve">jamais rapatriés sur le réseau du CHU et ne sont jamais supprimés par l’agent de synchronisation.</w:t>
+        <w:t xml:space="preserve">device_uuid</w:t>
+      </w:r>
+      <w:r>
+        <w:t xml:space="preserve">.</w:t>
       </w:r>
     </w:p>
     <w:p>
@@ -2651,71 +2752,23 @@
           <w:b/>
           <w:bCs/>
         </w:rPr>
-        <w:t xml:space="preserve">Contrôle d’intégrité de transfert :</w:t>
-      </w:r>
-      <w:r>
-        <w:t xml:space="preserve"> </w:t>
-      </w:r>
-      <w:r>
-        <w:t xml:space="preserve">L’agent compare la taille exacte du fichier téléchargé</w:t>
-      </w:r>
-      <w:r>
-        <w:t xml:space="preserve"> </w:t>
-      </w:r>
-      <w:r>
-        <w:t xml:space="preserve">avec l’en-tête</w:t>
-      </w:r>
-      <w:r>
-        <w:t xml:space="preserve"> </w:t>
-      </w:r>
-      <w:r>
-        <w:rPr>
-          <w:rStyle w:val="VerbatimChar"/>
-        </w:rPr>
-        <w:t xml:space="preserve">Content-Length</w:t>
-      </w:r>
-      <w:r>
-        <w:t xml:space="preserve"> </w:t>
-      </w:r>
-      <w:r>
-        <w:t xml:space="preserve">émis par le serveur WebDAV. En cas d’écart (téléchargement partiel),</w:t>
-      </w:r>
-      <w:r>
-        <w:t xml:space="preserve"> </w:t>
-      </w:r>
-      <w:r>
-        <w:t xml:space="preserve">le fichier local temporaire</w:t>
-      </w:r>
-      <w:r>
-        <w:t xml:space="preserve"> </w:t>
-      </w:r>
-      <w:r>
-        <w:rPr>
-          <w:rStyle w:val="VerbatimChar"/>
-        </w:rPr>
-        <w:t xml:space="preserve">.tmp</w:t>
-      </w:r>
-      <w:r>
-        <w:t xml:space="preserve"> </w:t>
-      </w:r>
-      <w:r>
-        <w:t xml:space="preserve">est détruit et le fichier distant est conservé intact pour un</w:t>
-      </w:r>
-      <w:r>
-        <w:t xml:space="preserve"> </w:t>
-      </w:r>
-      <w:r>
-        <w:t xml:space="preserve">nouvel essai.</w:t>
+        <w:t xml:space="preserve">Validation SSL stricte :</w:t>
+      </w:r>
+      <w:r>
+        <w:t xml:space="preserve"> </w:t>
+      </w:r>
+      <w:r>
+        <w:t xml:space="preserve">Vérification systématique de la chaîne de certification.</w:t>
       </w:r>
     </w:p>
     <w:bookmarkEnd w:id="24"/>
-    <w:bookmarkStart w:id="25" w:name="X5732cfa179825104bb2c88a5c436d1c0500aa09"/>
+    <w:bookmarkStart w:id="25" w:name="hébergement-et-stockage-hds"/>
     <w:p>
       <w:pPr>
         <w:pStyle w:val="Heading3"/>
       </w:pPr>
       <w:r>
-        <w:t xml:space="preserve">4.5 Supervision et Résilience de l’Agent Local</w:t>
+        <w:t xml:space="preserve">4.3 Hébergement et stockage HDS</w:t>
       </w:r>
     </w:p>
     <w:p>
@@ -2731,25 +2784,51 @@
           <w:b/>
           <w:bCs/>
         </w:rPr>
-        <w:t xml:space="preserve">Démarrage résilient :</w:t>
-      </w:r>
-      <w:r>
-        <w:t xml:space="preserve"> </w:t>
-      </w:r>
-      <w:r>
-        <w:t xml:space="preserve">Au démarrage de la session ou du système Windows, l’agent exécute</w:t>
-      </w:r>
-      <w:r>
-        <w:t xml:space="preserve"> </w:t>
-      </w:r>
-      <w:r>
-        <w:t xml:space="preserve">une boucle d’attente réseau non bloquante (contrôle toutes les 5 secondes) jusqu’à ce que la passerelle</w:t>
-      </w:r>
-      <w:r>
-        <w:t xml:space="preserve"> </w:t>
-      </w:r>
-      <w:r>
-        <w:t xml:space="preserve">et le DNS hospitalier soient opérationnels, évitant les crashs au boot.</w:t>
+        <w:t xml:space="preserve">Zone HDS multi-fournisseurs français :</w:t>
+      </w:r>
+    </w:p>
+    <w:p>
+      <w:pPr>
+        <w:pStyle w:val="Compact"/>
+        <w:numPr>
+          <w:ilvl w:val="1"/>
+          <w:numId w:val="1020"/>
+        </w:numPr>
+      </w:pPr>
+      <w:r>
+        <w:rPr>
+          <w:b/>
+          <w:bCs/>
+        </w:rPr>
+        <w:t xml:space="preserve">Serveur WebDAV (compute)</w:t>
+      </w:r>
+      <w:r>
+        <w:t xml:space="preserve"> </w:t>
+      </w:r>
+      <w:r>
+        <w:t xml:space="preserve">: hébergé chez Scalingo (certifié HDS et ISO 27001).</w:t>
+      </w:r>
+    </w:p>
+    <w:p>
+      <w:pPr>
+        <w:pStyle w:val="Compact"/>
+        <w:numPr>
+          <w:ilvl w:val="1"/>
+          <w:numId w:val="1020"/>
+        </w:numPr>
+      </w:pPr>
+      <w:r>
+        <w:rPr>
+          <w:b/>
+          <w:bCs/>
+        </w:rPr>
+        <w:t xml:space="preserve">Stockage objet (S3)</w:t>
+      </w:r>
+      <w:r>
+        <w:t xml:space="preserve"> </w:t>
+      </w:r>
+      <w:r>
+        <w:t xml:space="preserve">: hébergé chez Hosteur (certifié HDS et ISO 27001).</w:t>
       </w:r>
     </w:p>
     <w:p>
@@ -2765,19 +2844,13 @@
           <w:b/>
           <w:bCs/>
         </w:rPr>
-        <w:t xml:space="preserve">Déploiement Per-User / Service :</w:t>
-      </w:r>
-      <w:r>
-        <w:t xml:space="preserve"> </w:t>
-      </w:r>
-      <w:r>
-        <w:t xml:space="preserve">L’agent peut s’exécuter sous session utilisateur sans</w:t>
-      </w:r>
-      <w:r>
-        <w:t xml:space="preserve"> </w:t>
-      </w:r>
-      <w:r>
-        <w:t xml:space="preserve">nécessiter d’élévation permanente des privilèges administrateur.</w:t>
+        <w:t xml:space="preserve">Chiffrement au repos :</w:t>
+      </w:r>
+      <w:r>
+        <w:t xml:space="preserve"> </w:t>
+      </w:r>
+      <w:r>
+        <w:t xml:space="preserve">Chiffrement natif AES-256 (SSE-S3).</w:t>
       </w:r>
     </w:p>
     <w:p>
@@ -2786,6 +2859,326 @@
         <w:numPr>
           <w:ilvl w:val="0"/>
           <w:numId w:val="1019"/>
+        </w:numPr>
+      </w:pPr>
+      <w:r>
+        <w:rPr>
+          <w:b/>
+          <w:bCs/>
+        </w:rPr>
+        <w:t xml:space="preserve">Isolation logique forte :</w:t>
+      </w:r>
+    </w:p>
+    <w:p>
+      <w:pPr>
+        <w:pStyle w:val="Compact"/>
+        <w:numPr>
+          <w:ilvl w:val="1"/>
+          <w:numId w:val="1021"/>
+        </w:numPr>
+      </w:pPr>
+      <w:r>
+        <w:t xml:space="preserve">Un dossier racine dédié et étanche par établissement.</w:t>
+      </w:r>
+    </w:p>
+    <w:p>
+      <w:pPr>
+        <w:pStyle w:val="Compact"/>
+        <w:numPr>
+          <w:ilvl w:val="1"/>
+          <w:numId w:val="1021"/>
+        </w:numPr>
+      </w:pPr>
+      <w:r>
+        <w:t xml:space="preserve">Un jeton WebDAV unique par dossier racine.</w:t>
+      </w:r>
+    </w:p>
+    <w:p>
+      <w:pPr>
+        <w:pStyle w:val="Compact"/>
+        <w:numPr>
+          <w:ilvl w:val="1"/>
+          <w:numId w:val="1021"/>
+        </w:numPr>
+      </w:pPr>
+      <w:r>
+        <w:t xml:space="preserve">Rejet des accès croisés.</w:t>
+      </w:r>
+    </w:p>
+    <w:bookmarkEnd w:id="25"/>
+    <w:bookmarkStart w:id="26" w:name="dispositif-de-quarantaine-et-intégrité"/>
+    <w:p>
+      <w:pPr>
+        <w:pStyle w:val="Heading3"/>
+      </w:pPr>
+      <w:r>
+        <w:t xml:space="preserve">4.4 Dispositif de Quarantaine et Intégrité</w:t>
+      </w:r>
+    </w:p>
+    <w:p>
+      <w:pPr>
+        <w:pStyle w:val="Compact"/>
+        <w:numPr>
+          <w:ilvl w:val="0"/>
+          <w:numId w:val="1022"/>
+        </w:numPr>
+      </w:pPr>
+      <w:r>
+        <w:rPr>
+          <w:b/>
+          <w:bCs/>
+        </w:rPr>
+        <w:t xml:space="preserve">Gestion des fichiers suspects (Quarantaine serveur) :</w:t>
+      </w:r>
+      <w:r>
+        <w:t xml:space="preserve"> </w:t>
+      </w:r>
+      <w:r>
+        <w:t xml:space="preserve">Les fichiers identifiés comme</w:t>
+      </w:r>
+      <w:r>
+        <w:t xml:space="preserve"> </w:t>
+      </w:r>
+      <w:r>
+        <w:t xml:space="preserve">anormaux par les contrôles d’intégrité cloud sont déplacés dans un dossier isolé</w:t>
+      </w:r>
+      <w:r>
+        <w:t xml:space="preserve"> </w:t>
+      </w:r>
+      <w:r>
+        <w:rPr>
+          <w:rStyle w:val="VerbatimChar"/>
+        </w:rPr>
+        <w:t xml:space="preserve">_quarantine</w:t>
+      </w:r>
+      <w:r>
+        <w:t xml:space="preserve">.</w:t>
+      </w:r>
+    </w:p>
+    <w:p>
+      <w:pPr>
+        <w:pStyle w:val="Compact"/>
+        <w:numPr>
+          <w:ilvl w:val="0"/>
+          <w:numId w:val="1022"/>
+        </w:numPr>
+      </w:pPr>
+      <w:r>
+        <w:rPr>
+          <w:b/>
+          <w:bCs/>
+        </w:rPr>
+        <w:t xml:space="preserve">Exclusion stricte côté agent local :</w:t>
+      </w:r>
+      <w:r>
+        <w:t xml:space="preserve"> </w:t>
+      </w:r>
+      <w:r>
+        <w:t xml:space="preserve">L’agent Windows</w:t>
+      </w:r>
+      <w:r>
+        <w:t xml:space="preserve"> </w:t>
+      </w:r>
+      <w:r>
+        <w:rPr>
+          <w:rStyle w:val="VerbatimChar"/>
+        </w:rPr>
+        <w:t xml:space="preserve">MacroscopixSync</w:t>
+      </w:r>
+      <w:r>
+        <w:t xml:space="preserve"> </w:t>
+      </w:r>
+      <w:r>
+        <w:t xml:space="preserve">filtre et ignore</w:t>
+      </w:r>
+      <w:r>
+        <w:t xml:space="preserve"> </w:t>
+      </w:r>
+      <w:r>
+        <w:t xml:space="preserve">rigoureusement tout dossier ou fichier contenant</w:t>
+      </w:r>
+      <w:r>
+        <w:t xml:space="preserve"> </w:t>
+      </w:r>
+      <w:r>
+        <w:rPr>
+          <w:rStyle w:val="VerbatimChar"/>
+        </w:rPr>
+        <w:t xml:space="preserve">quarantine</w:t>
+      </w:r>
+      <w:r>
+        <w:t xml:space="preserve"> </w:t>
+      </w:r>
+      <w:r>
+        <w:t xml:space="preserve">ou</w:t>
+      </w:r>
+      <w:r>
+        <w:t xml:space="preserve"> </w:t>
+      </w:r>
+      <w:r>
+        <w:rPr>
+          <w:rStyle w:val="VerbatimChar"/>
+        </w:rPr>
+        <w:t xml:space="preserve">_quarantine</w:t>
+      </w:r>
+      <w:r>
+        <w:t xml:space="preserve">. Ces fichiers ne sont</w:t>
+      </w:r>
+      <w:r>
+        <w:t xml:space="preserve"> </w:t>
+      </w:r>
+      <w:r>
+        <w:t xml:space="preserve">jamais rapatriés sur le réseau du CHU et ne sont jamais supprimés par l’agent de synchronisation.</w:t>
+      </w:r>
+    </w:p>
+    <w:p>
+      <w:pPr>
+        <w:pStyle w:val="Compact"/>
+        <w:numPr>
+          <w:ilvl w:val="0"/>
+          <w:numId w:val="1022"/>
+        </w:numPr>
+      </w:pPr>
+      <w:r>
+        <w:rPr>
+          <w:b/>
+          <w:bCs/>
+        </w:rPr>
+        <w:t xml:space="preserve">Contrôle d’intégrité de transfert :</w:t>
+      </w:r>
+      <w:r>
+        <w:t xml:space="preserve"> </w:t>
+      </w:r>
+      <w:r>
+        <w:t xml:space="preserve">L’agent compare la taille exacte du fichier téléchargé</w:t>
+      </w:r>
+      <w:r>
+        <w:t xml:space="preserve"> </w:t>
+      </w:r>
+      <w:r>
+        <w:t xml:space="preserve">avec l’en-tête</w:t>
+      </w:r>
+      <w:r>
+        <w:t xml:space="preserve"> </w:t>
+      </w:r>
+      <w:r>
+        <w:rPr>
+          <w:rStyle w:val="VerbatimChar"/>
+        </w:rPr>
+        <w:t xml:space="preserve">Content-Length</w:t>
+      </w:r>
+      <w:r>
+        <w:t xml:space="preserve"> </w:t>
+      </w:r>
+      <w:r>
+        <w:t xml:space="preserve">émis par le serveur WebDAV. En cas d’écart (téléchargement partiel),</w:t>
+      </w:r>
+      <w:r>
+        <w:t xml:space="preserve"> </w:t>
+      </w:r>
+      <w:r>
+        <w:t xml:space="preserve">le fichier local temporaire</w:t>
+      </w:r>
+      <w:r>
+        <w:t xml:space="preserve"> </w:t>
+      </w:r>
+      <w:r>
+        <w:rPr>
+          <w:rStyle w:val="VerbatimChar"/>
+        </w:rPr>
+        <w:t xml:space="preserve">.tmp</w:t>
+      </w:r>
+      <w:r>
+        <w:t xml:space="preserve"> </w:t>
+      </w:r>
+      <w:r>
+        <w:t xml:space="preserve">est détruit et le fichier distant est conservé intact pour un</w:t>
+      </w:r>
+      <w:r>
+        <w:t xml:space="preserve"> </w:t>
+      </w:r>
+      <w:r>
+        <w:t xml:space="preserve">nouvel essai.</w:t>
+      </w:r>
+    </w:p>
+    <w:bookmarkEnd w:id="26"/>
+    <w:bookmarkStart w:id="27" w:name="X5732cfa179825104bb2c88a5c436d1c0500aa09"/>
+    <w:p>
+      <w:pPr>
+        <w:pStyle w:val="Heading3"/>
+      </w:pPr>
+      <w:r>
+        <w:t xml:space="preserve">4.5 Supervision et Résilience de l’Agent Local</w:t>
+      </w:r>
+    </w:p>
+    <w:p>
+      <w:pPr>
+        <w:pStyle w:val="Compact"/>
+        <w:numPr>
+          <w:ilvl w:val="0"/>
+          <w:numId w:val="1023"/>
+        </w:numPr>
+      </w:pPr>
+      <w:r>
+        <w:rPr>
+          <w:b/>
+          <w:bCs/>
+        </w:rPr>
+        <w:t xml:space="preserve">Démarrage résilient :</w:t>
+      </w:r>
+      <w:r>
+        <w:t xml:space="preserve"> </w:t>
+      </w:r>
+      <w:r>
+        <w:t xml:space="preserve">Au démarrage de la session ou du système Windows, l’agent exécute</w:t>
+      </w:r>
+      <w:r>
+        <w:t xml:space="preserve"> </w:t>
+      </w:r>
+      <w:r>
+        <w:t xml:space="preserve">une boucle d’attente réseau non bloquante (contrôle toutes les 5 secondes) jusqu’à ce que la passerelle</w:t>
+      </w:r>
+      <w:r>
+        <w:t xml:space="preserve"> </w:t>
+      </w:r>
+      <w:r>
+        <w:t xml:space="preserve">et le DNS hospitalier soient opérationnels, évitant les crashs au boot.</w:t>
+      </w:r>
+    </w:p>
+    <w:p>
+      <w:pPr>
+        <w:pStyle w:val="Compact"/>
+        <w:numPr>
+          <w:ilvl w:val="0"/>
+          <w:numId w:val="1023"/>
+        </w:numPr>
+      </w:pPr>
+      <w:r>
+        <w:rPr>
+          <w:b/>
+          <w:bCs/>
+        </w:rPr>
+        <w:t xml:space="preserve">Déploiement Per-User / Service :</w:t>
+      </w:r>
+      <w:r>
+        <w:t xml:space="preserve"> </w:t>
+      </w:r>
+      <w:r>
+        <w:t xml:space="preserve">L’agent peut s’exécuter sous session utilisateur sans</w:t>
+      </w:r>
+      <w:r>
+        <w:t xml:space="preserve"> </w:t>
+      </w:r>
+      <w:r>
+        <w:t xml:space="preserve">nécessiter d’élévation permanente des privilèges administrateur.</w:t>
+      </w:r>
+    </w:p>
+    <w:p>
+      <w:pPr>
+        <w:pStyle w:val="Compact"/>
+        <w:numPr>
+          <w:ilvl w:val="0"/>
+          <w:numId w:val="1023"/>
         </w:numPr>
       </w:pPr>
       <w:r>
@@ -2815,9 +3208,9 @@
         </w:pict>
       </w:r>
     </w:p>
-    <w:bookmarkEnd w:id="25"/>
-    <w:bookmarkEnd w:id="26"/>
-    <w:bookmarkStart w:id="27" w:name="conformité-rgpd-et-hds"/>
+    <w:bookmarkEnd w:id="27"/>
+    <w:bookmarkEnd w:id="28"/>
+    <w:bookmarkStart w:id="29" w:name="conformité-rgpd-et-hds"/>
     <w:p>
       <w:pPr>
         <w:pStyle w:val="Heading2"/>
@@ -2977,8 +3370,8 @@
         </w:tc>
       </w:tr>
     </w:tbl>
-    <w:bookmarkEnd w:id="27"/>
-    <w:bookmarkStart w:id="28" w:name="prérequis-côté-chu"/>
+    <w:bookmarkEnd w:id="29"/>
+    <w:bookmarkStart w:id="30" w:name="prérequis-côté-chu"/>
     <w:p>
       <w:pPr>
         <w:pStyle w:val="Heading2"/>
@@ -2992,7 +3385,7 @@
         <w:pStyle w:val="Compact"/>
         <w:numPr>
           <w:ilvl w:val="0"/>
-          <w:numId w:val="1020"/>
+          <w:numId w:val="1024"/>
         </w:numPr>
       </w:pPr>
       <w:r>
@@ -3020,7 +3413,7 @@
         <w:pStyle w:val="Compact"/>
         <w:numPr>
           <w:ilvl w:val="0"/>
-          <w:numId w:val="1020"/>
+          <w:numId w:val="1024"/>
         </w:numPr>
       </w:pPr>
       <w:r>
@@ -3054,7 +3447,7 @@
         <w:pStyle w:val="Compact"/>
         <w:numPr>
           <w:ilvl w:val="0"/>
-          <w:numId w:val="1020"/>
+          <w:numId w:val="1024"/>
         </w:numPr>
       </w:pPr>
       <w:r>
@@ -3077,7 +3470,7 @@
         <w:t xml:space="preserve">(Photos, Documents PDF, Fichiers Audio).</w:t>
       </w:r>
     </w:p>
-    <w:bookmarkEnd w:id="28"/>
+    <w:bookmarkEnd w:id="30"/>
     <w:sectPr>
       <w:footnotePr>
         <w:numRestart w:val="eachSect"/>
@@ -3386,9 +3779,6 @@
     <w:abstractNumId w:val="991"/>
   </w:num>
   <w:num w:numId="1003">
-    <w:abstractNumId w:val="991"/>
-  </w:num>
-  <w:num w:numId="1004">
     <w:abstractNumId w:val="99411"/>
     <w:lvlOverride w:ilvl="0">
       <w:startOverride w:val="1"/>
@@ -3418,6 +3808,9 @@
       <w:startOverride w:val="1"/>
     </w:lvlOverride>
   </w:num>
+  <w:num w:numId="1004">
+    <w:abstractNumId w:val="991"/>
+  </w:num>
   <w:num w:numId="1005">
     <w:abstractNumId w:val="991"/>
   </w:num>
@@ -3428,12 +3821,6 @@
     <w:abstractNumId w:val="991"/>
   </w:num>
   <w:num w:numId="1008">
-    <w:abstractNumId w:val="991"/>
-  </w:num>
-  <w:num w:numId="1009">
-    <w:abstractNumId w:val="991"/>
-  </w:num>
-  <w:num w:numId="1010">
     <w:abstractNumId w:val="99411"/>
     <w:lvlOverride w:ilvl="0">
       <w:startOverride w:val="1"/>
@@ -3463,6 +3850,12 @@
       <w:startOverride w:val="1"/>
     </w:lvlOverride>
   </w:num>
+  <w:num w:numId="1009">
+    <w:abstractNumId w:val="991"/>
+  </w:num>
+  <w:num w:numId="1010">
+    <w:abstractNumId w:val="991"/>
+  </w:num>
   <w:num w:numId="1011">
     <w:abstractNumId w:val="991"/>
   </w:num>
@@ -3473,7 +3866,34 @@
     <w:abstractNumId w:val="991"/>
   </w:num>
   <w:num w:numId="1014">
-    <w:abstractNumId w:val="991"/>
+    <w:abstractNumId w:val="99411"/>
+    <w:lvlOverride w:ilvl="0">
+      <w:startOverride w:val="1"/>
+    </w:lvlOverride>
+    <w:lvlOverride w:ilvl="1">
+      <w:startOverride w:val="1"/>
+    </w:lvlOverride>
+    <w:lvlOverride w:ilvl="2">
+      <w:startOverride w:val="1"/>
+    </w:lvlOverride>
+    <w:lvlOverride w:ilvl="3">
+      <w:startOverride w:val="1"/>
+    </w:lvlOverride>
+    <w:lvlOverride w:ilvl="4">
+      <w:startOverride w:val="1"/>
+    </w:lvlOverride>
+    <w:lvlOverride w:ilvl="5">
+      <w:startOverride w:val="1"/>
+    </w:lvlOverride>
+    <w:lvlOverride w:ilvl="6">
+      <w:startOverride w:val="1"/>
+    </w:lvlOverride>
+    <w:lvlOverride w:ilvl="7">
+      <w:startOverride w:val="1"/>
+    </w:lvlOverride>
+    <w:lvlOverride w:ilvl="8">
+      <w:startOverride w:val="1"/>
+    </w:lvlOverride>
   </w:num>
   <w:num w:numId="1015">
     <w:abstractNumId w:val="991"/>
@@ -3491,6 +3911,18 @@
     <w:abstractNumId w:val="991"/>
   </w:num>
   <w:num w:numId="1020">
+    <w:abstractNumId w:val="991"/>
+  </w:num>
+  <w:num w:numId="1021">
+    <w:abstractNumId w:val="991"/>
+  </w:num>
+  <w:num w:numId="1022">
+    <w:abstractNumId w:val="991"/>
+  </w:num>
+  <w:num w:numId="1023">
+    <w:abstractNumId w:val="991"/>
+  </w:num>
+  <w:num w:numId="1024">
     <w:abstractNumId w:val="99411"/>
     <w:lvlOverride w:ilvl="0">
       <w:startOverride w:val="1"/>

</xml_diff>

<commit_message>
docs(dats): explicitation de la zero persistance serveur (RAM stateless, purge locale immediate et S3 Lifecycle 24h)
</commit_message>
<xml_diff>
--- a/docx/01_DATS.docx
+++ b/docx/01_DATS.docx
@@ -2762,13 +2762,37 @@
       </w:r>
     </w:p>
     <w:bookmarkEnd w:id="24"/>
-    <w:bookmarkStart w:id="25" w:name="hébergement-et-stockage-hds"/>
+    <w:bookmarkStart w:id="25" w:name="X354946decdb3b25b3898d8b7890d04cabebf218"/>
     <w:p>
       <w:pPr>
         <w:pStyle w:val="Heading3"/>
       </w:pPr>
       <w:r>
-        <w:t xml:space="preserve">4.3 Hébergement et stockage HDS</w:t>
+        <w:t xml:space="preserve">4.3 Hébergement HDS et Zéro Persistance Serveur (Architecture Stateless)</w:t>
+      </w:r>
+    </w:p>
+    <w:p>
+      <w:pPr>
+        <w:pStyle w:val="FirstParagraph"/>
+      </w:pPr>
+      <w:r>
+        <w:t xml:space="preserve">La solution met en œuvre un principe strict de</w:t>
+      </w:r>
+      <w:r>
+        <w:t xml:space="preserve"> </w:t>
+      </w:r>
+      <w:r>
+        <w:rPr>
+          <w:b/>
+          <w:bCs/>
+        </w:rPr>
+        <w:t xml:space="preserve">non-persistance des données de santé sur le serveur</w:t>
+      </w:r>
+      <w:r>
+        <w:t xml:space="preserve"> </w:t>
+      </w:r>
+      <w:r>
+        <w:t xml:space="preserve">:</w:t>
       </w:r>
     </w:p>
     <w:p>
@@ -2784,7 +2808,7 @@
           <w:b/>
           <w:bCs/>
         </w:rPr>
-        <w:t xml:space="preserve">Zone HDS multi-fournisseurs français :</w:t>
+        <w:t xml:space="preserve">Traitement Stateless en Mémoire Vive (RAM) :</w:t>
       </w:r>
     </w:p>
     <w:p>
@@ -2796,17 +2820,7 @@
         </w:numPr>
       </w:pPr>
       <w:r>
-        <w:rPr>
-          <w:b/>
-          <w:bCs/>
-        </w:rPr>
-        <w:t xml:space="preserve">Serveur WebDAV (compute)</w:t>
-      </w:r>
-      <w:r>
-        <w:t xml:space="preserve"> </w:t>
-      </w:r>
-      <w:r>
-        <w:t xml:space="preserve">: hébergé chez Scalingo (certifié HDS et ISO 27001).</w:t>
+        <w:t xml:space="preserve">Le serveur WebDAV (compute Scalingo HDS) ne dispose d’aucun stockage disque persistant pour les données de santé.</w:t>
       </w:r>
     </w:p>
     <w:p>
@@ -2818,17 +2832,16 @@
         </w:numPr>
       </w:pPr>
       <w:r>
-        <w:rPr>
-          <w:b/>
-          <w:bCs/>
-        </w:rPr>
-        <w:t xml:space="preserve">Stockage objet (S3)</w:t>
-      </w:r>
-      <w:r>
-        <w:t xml:space="preserve"> </w:t>
-      </w:r>
-      <w:r>
-        <w:t xml:space="preserve">: hébergé chez Hosteur (certifié HDS et ISO 27001).</w:t>
+        <w:t xml:space="preserve">Les fichiers entrants transitent exclusivement dans des buffers mémoires (</w:t>
+      </w:r>
+      <w:r>
+        <w:rPr>
+          <w:rStyle w:val="VerbatimChar"/>
+        </w:rPr>
+        <w:t xml:space="preserve">BytesIO</w:t>
+      </w:r>
+      <w:r>
+        <w:t xml:space="preserve">). Aucun fichier temporaire ou résidu n’est écrit sur le système de fichiers de l’instance d’exécution.</w:t>
       </w:r>
     </w:p>
     <w:p>
@@ -2844,13 +2857,113 @@
           <w:b/>
           <w:bCs/>
         </w:rPr>
-        <w:t xml:space="preserve">Chiffrement au repos :</w:t>
-      </w:r>
-      <w:r>
-        <w:t xml:space="preserve"> </w:t>
-      </w:r>
-      <w:r>
-        <w:t xml:space="preserve">Chiffrement natif AES-256 (SSE-S3).</w:t>
+        <w:t xml:space="preserve">Double Mécanisme de Purge Cloud :</w:t>
+      </w:r>
+    </w:p>
+    <w:p>
+      <w:pPr>
+        <w:pStyle w:val="Compact"/>
+        <w:numPr>
+          <w:ilvl w:val="1"/>
+          <w:numId w:val="1021"/>
+        </w:numPr>
+      </w:pPr>
+      <w:r>
+        <w:rPr>
+          <w:b/>
+          <w:bCs/>
+        </w:rPr>
+        <w:t xml:space="preserve">Purge Immédiate par l’Agent Local (Nominale) :</w:t>
+      </w:r>
+      <w:r>
+        <w:t xml:space="preserve"> </w:t>
+      </w:r>
+      <w:r>
+        <w:t xml:space="preserve">Dès que l’agent</w:t>
+      </w:r>
+      <w:r>
+        <w:t xml:space="preserve"> </w:t>
+      </w:r>
+      <w:r>
+        <w:rPr>
+          <w:rStyle w:val="VerbatimChar"/>
+        </w:rPr>
+        <w:t xml:space="preserve">MacroscopixSync</w:t>
+      </w:r>
+      <w:r>
+        <w:t xml:space="preserve"> </w:t>
+      </w:r>
+      <w:r>
+        <w:t xml:space="preserve">a rapatrié le fichier sur le stockage de l’établissement et validé son intégrité octet par octet (</w:t>
+      </w:r>
+      <w:r>
+        <w:rPr>
+          <w:rStyle w:val="VerbatimChar"/>
+        </w:rPr>
+        <w:t xml:space="preserve">Content-Length</w:t>
+      </w:r>
+      <w:r>
+        <w:t xml:space="preserve">), il envoie immédiatement une commande HTTP</w:t>
+      </w:r>
+      <w:r>
+        <w:t xml:space="preserve"> </w:t>
+      </w:r>
+      <w:r>
+        <w:rPr>
+          <w:rStyle w:val="VerbatimChar"/>
+        </w:rPr>
+        <w:t xml:space="preserve">DELETE</w:t>
+      </w:r>
+      <w:r>
+        <w:t xml:space="preserve">. Le fichier est instantanément supprimé du bucket S3 HDS.</w:t>
+      </w:r>
+    </w:p>
+    <w:p>
+      <w:pPr>
+        <w:pStyle w:val="Compact"/>
+        <w:numPr>
+          <w:ilvl w:val="1"/>
+          <w:numId w:val="1021"/>
+        </w:numPr>
+      </w:pPr>
+      <w:r>
+        <w:rPr>
+          <w:b/>
+          <w:bCs/>
+        </w:rPr>
+        <w:t xml:space="preserve">Purge Automatique Programmée (Filet de sécurité Lifecycle 24h) :</w:t>
+      </w:r>
+      <w:r>
+        <w:t xml:space="preserve"> </w:t>
+      </w:r>
+      <w:r>
+        <w:t xml:space="preserve">Une règle de cycle de vie (</w:t>
+      </w:r>
+      <w:r>
+        <w:rPr>
+          <w:b/>
+          <w:bCs/>
+        </w:rPr>
+        <w:t xml:space="preserve">S3 Lifecycle Policy</w:t>
+      </w:r>
+      <w:r>
+        <w:t xml:space="preserve">) est configurée nativement sur le stockage objet HDS (Hosteur). Tout fichier présent depuis plus de 24 heures (ex. en cas de panne prolongée ou de coupure réseau du poste hospitalier) est</w:t>
+      </w:r>
+      <w:r>
+        <w:t xml:space="preserve"> </w:t>
+      </w:r>
+      <w:r>
+        <w:rPr>
+          <w:b/>
+          <w:bCs/>
+        </w:rPr>
+        <w:t xml:space="preserve">détruit automatiquement et irréversiblement</w:t>
+      </w:r>
+      <w:r>
+        <w:t xml:space="preserve"> </w:t>
+      </w:r>
+      <w:r>
+        <w:t xml:space="preserve">sans intervention humaine.</w:t>
       </w:r>
     </w:p>
     <w:p>
@@ -2866,7 +2979,7 @@
           <w:b/>
           <w:bCs/>
         </w:rPr>
-        <w:t xml:space="preserve">Isolation logique forte :</w:t>
+        <w:t xml:space="preserve">Sécurité et Souveraineté du Stockage :</w:t>
       </w:r>
     </w:p>
     <w:p>
@@ -2874,11 +2987,27 @@
         <w:pStyle w:val="Compact"/>
         <w:numPr>
           <w:ilvl w:val="1"/>
-          <w:numId w:val="1021"/>
-        </w:numPr>
-      </w:pPr>
-      <w:r>
-        <w:t xml:space="preserve">Un dossier racine dédié et étanche par établissement.</w:t>
+          <w:numId w:val="1022"/>
+        </w:numPr>
+      </w:pPr>
+      <w:r>
+        <w:t xml:space="preserve">Hébergement 100 % français sur infrastructures certifiées</w:t>
+      </w:r>
+      <w:r>
+        <w:t xml:space="preserve"> </w:t>
+      </w:r>
+      <w:r>
+        <w:rPr>
+          <w:b/>
+          <w:bCs/>
+        </w:rPr>
+        <w:t xml:space="preserve">HDS (Hébergeur de Données de Santé)</w:t>
+      </w:r>
+      <w:r>
+        <w:t xml:space="preserve"> </w:t>
+      </w:r>
+      <w:r>
+        <w:t xml:space="preserve">et ISO 27001.</w:t>
       </w:r>
     </w:p>
     <w:p>
@@ -2886,11 +3015,11 @@
         <w:pStyle w:val="Compact"/>
         <w:numPr>
           <w:ilvl w:val="1"/>
-          <w:numId w:val="1021"/>
-        </w:numPr>
-      </w:pPr>
-      <w:r>
-        <w:t xml:space="preserve">Un jeton WebDAV unique par dossier racine.</w:t>
+          <w:numId w:val="1022"/>
+        </w:numPr>
+      </w:pPr>
+      <w:r>
+        <w:t xml:space="preserve">Chiffrement natif au repos AES-256 (SSE-S3).</w:t>
       </w:r>
     </w:p>
     <w:p>
@@ -2898,11 +3027,20 @@
         <w:pStyle w:val="Compact"/>
         <w:numPr>
           <w:ilvl w:val="1"/>
-          <w:numId w:val="1021"/>
-        </w:numPr>
-      </w:pPr>
-      <w:r>
-        <w:t xml:space="preserve">Rejet des accès croisés.</w:t>
+          <w:numId w:val="1022"/>
+        </w:numPr>
+      </w:pPr>
+      <w:r>
+        <w:t xml:space="preserve">Cloisonnement étanche : chaque établissement dispose d’un espace racine isolé et d’un jeton d’accès exclusif (</w:t>
+      </w:r>
+      <w:r>
+        <w:rPr>
+          <w:rStyle w:val="VerbatimChar"/>
+        </w:rPr>
+        <w:t xml:space="preserve">chroot</w:t>
+      </w:r>
+      <w:r>
+        <w:t xml:space="preserve">).</w:t>
       </w:r>
     </w:p>
     <w:bookmarkEnd w:id="25"/>
@@ -2920,7 +3058,7 @@
         <w:pStyle w:val="Compact"/>
         <w:numPr>
           <w:ilvl w:val="0"/>
-          <w:numId w:val="1022"/>
+          <w:numId w:val="1023"/>
         </w:numPr>
       </w:pPr>
       <w:r>
@@ -2960,7 +3098,7 @@
         <w:pStyle w:val="Compact"/>
         <w:numPr>
           <w:ilvl w:val="0"/>
-          <w:numId w:val="1022"/>
+          <w:numId w:val="1023"/>
         </w:numPr>
       </w:pPr>
       <w:r>
@@ -3036,7 +3174,7 @@
         <w:pStyle w:val="Compact"/>
         <w:numPr>
           <w:ilvl w:val="0"/>
-          <w:numId w:val="1022"/>
+          <w:numId w:val="1023"/>
         </w:numPr>
       </w:pPr>
       <w:r>
@@ -3116,7 +3254,7 @@
         <w:pStyle w:val="Compact"/>
         <w:numPr>
           <w:ilvl w:val="0"/>
-          <w:numId w:val="1023"/>
+          <w:numId w:val="1024"/>
         </w:numPr>
       </w:pPr>
       <w:r>
@@ -3150,7 +3288,7 @@
         <w:pStyle w:val="Compact"/>
         <w:numPr>
           <w:ilvl w:val="0"/>
-          <w:numId w:val="1023"/>
+          <w:numId w:val="1024"/>
         </w:numPr>
       </w:pPr>
       <w:r>
@@ -3178,7 +3316,7 @@
         <w:pStyle w:val="Compact"/>
         <w:numPr>
           <w:ilvl w:val="0"/>
-          <w:numId w:val="1023"/>
+          <w:numId w:val="1024"/>
         </w:numPr>
       </w:pPr>
       <w:r>
@@ -3385,7 +3523,7 @@
         <w:pStyle w:val="Compact"/>
         <w:numPr>
           <w:ilvl w:val="0"/>
-          <w:numId w:val="1024"/>
+          <w:numId w:val="1025"/>
         </w:numPr>
       </w:pPr>
       <w:r>
@@ -3413,7 +3551,7 @@
         <w:pStyle w:val="Compact"/>
         <w:numPr>
           <w:ilvl w:val="0"/>
-          <w:numId w:val="1024"/>
+          <w:numId w:val="1025"/>
         </w:numPr>
       </w:pPr>
       <w:r>
@@ -3447,7 +3585,7 @@
         <w:pStyle w:val="Compact"/>
         <w:numPr>
           <w:ilvl w:val="0"/>
-          <w:numId w:val="1024"/>
+          <w:numId w:val="1025"/>
         </w:numPr>
       </w:pPr>
       <w:r>
@@ -3914,7 +4052,34 @@
     <w:abstractNumId w:val="991"/>
   </w:num>
   <w:num w:numId="1021">
-    <w:abstractNumId w:val="991"/>
+    <w:abstractNumId w:val="99411"/>
+    <w:lvlOverride w:ilvl="0">
+      <w:startOverride w:val="1"/>
+    </w:lvlOverride>
+    <w:lvlOverride w:ilvl="1">
+      <w:startOverride w:val="1"/>
+    </w:lvlOverride>
+    <w:lvlOverride w:ilvl="2">
+      <w:startOverride w:val="1"/>
+    </w:lvlOverride>
+    <w:lvlOverride w:ilvl="3">
+      <w:startOverride w:val="1"/>
+    </w:lvlOverride>
+    <w:lvlOverride w:ilvl="4">
+      <w:startOverride w:val="1"/>
+    </w:lvlOverride>
+    <w:lvlOverride w:ilvl="5">
+      <w:startOverride w:val="1"/>
+    </w:lvlOverride>
+    <w:lvlOverride w:ilvl="6">
+      <w:startOverride w:val="1"/>
+    </w:lvlOverride>
+    <w:lvlOverride w:ilvl="7">
+      <w:startOverride w:val="1"/>
+    </w:lvlOverride>
+    <w:lvlOverride w:ilvl="8">
+      <w:startOverride w:val="1"/>
+    </w:lvlOverride>
   </w:num>
   <w:num w:numId="1022">
     <w:abstractNumId w:val="991"/>
@@ -3923,6 +4088,9 @@
     <w:abstractNumId w:val="991"/>
   </w:num>
   <w:num w:numId="1024">
+    <w:abstractNumId w:val="991"/>
+  </w:num>
+  <w:num w:numId="1025">
     <w:abstractNumId w:val="99411"/>
     <w:lvlOverride w:ilvl="0">
       <w:startOverride w:val="1"/>

</xml_diff>

<commit_message>
docs: ajout 07_Conformite_HDS.md et mise a jour du fournisseur S3 HDS vers Scaleway
</commit_message>
<xml_diff>
--- a/docx/01_DATS.docx
+++ b/docx/01_DATS.docx
@@ -1788,7 +1788,7 @@
         <w:t xml:space="preserve"> </w:t>
       </w:r>
       <w:r>
-        <w:t xml:space="preserve">serveurs certifiés MacroscopiX (Scalingo compute HDS + Hosteur S3 HDS). Le service</w:t>
+        <w:t xml:space="preserve">serveurs certifiés MacroscopiX (Scalingo compute HDS + Scaleway S3 HDS). Le service</w:t>
       </w:r>
       <w:r>
         <w:t xml:space="preserve"> </w:t>
@@ -2947,7 +2947,7 @@
         <w:t xml:space="preserve">S3 Lifecycle Policy</w:t>
       </w:r>
       <w:r>
-        <w:t xml:space="preserve">) est configurée nativement sur le stockage objet HDS (Hosteur). Tout fichier présent depuis plus de 24 heures (ex. en cas de panne prolongée ou de coupure réseau du poste hospitalier) est</w:t>
+        <w:t xml:space="preserve">) est configurée nativement sur le stockage objet HDS (Scaleway). Tout fichier présent depuis plus de 24 heures (ex. en cas de panne prolongée ou de coupure réseau du poste hospitalier) est</w:t>
       </w:r>
       <w:r>
         <w:t xml:space="preserve"> </w:t>
@@ -3007,7 +3007,7 @@
         <w:t xml:space="preserve"> </w:t>
       </w:r>
       <w:r>
-        <w:t xml:space="preserve">et ISO 27001.</w:t>
+        <w:t xml:space="preserve">et ISO 27001 (Scalingo / Scaleway).</w:t>
       </w:r>
     </w:p>
     <w:p>
@@ -3474,7 +3474,7 @@
               <w:pStyle w:val="Compact"/>
             </w:pPr>
             <w:r>
-              <w:t xml:space="preserve">Données de santé (photos, audio, PDF) traitées et hébergées 100 % en France sur des datacenters certifiés HDS (Scalingo / Hosteur). Les métadonnées administratives sont hébergées chez Infomaniak (Suisse).</w:t>
+              <w:t xml:space="preserve">Données de santé (photos, audio, PDF) traitées et hébergées 100 % en France sur des datacenters certifiés HDS (Scalingo / Scaleway). Les métadonnées administratives sont hébergées chez Infomaniak (Suisse).</w:t>
             </w:r>
           </w:p>
         </w:tc>

</xml_diff>